<commit_message>
docs(assessments): add school/org codes, isDeleted, isPublished; cross-service code refs
Apply to both the data-model design (.docx) and the system design doc:
- add schoolCode + organizationCode to every entity
- rename status (active/inactive) flag to isDeleted boolean
- use codes for cross-service references, ids for same-service FKs
- add isPublished flag to assessments
- append mock data responses

Co-Authored-By: Claude Opus 4.8 <noreply@anthropic.com>
</commit_message>
<xml_diff>
--- a/Assessments-Module-Data-Model-Design.docx
+++ b/Assessments-Module-Data-Model-Design.docx
@@ -174,7 +174,7 @@
         <w:spacing w:after="60" w:line="276"/>
       </w:pPr>
       <w:r>
-        <w:t xml:space="preserve">Soft-delete stays a </w:t>
+        <w:t xml:space="preserve">Soft-delete is a </w:t>
       </w:r>
       <w:r>
         <w:rPr>
@@ -182,7 +182,7 @@
           <w:sz w:val="20"/>
           <w:szCs w:val="20"/>
         </w:rPr>
-        <w:t xml:space="preserve">bool active</w:t>
+        <w:t xml:space="preserve">bool isDeleted</w:t>
       </w:r>
       <w:r>
         <w:t xml:space="preserve"> on the client entity; the wire format's </w:t>
@@ -193,10 +193,10 @@
           <w:sz w:val="20"/>
           <w:szCs w:val="20"/>
         </w:rPr>
-        <w:t xml:space="preserve">status: active|inactive</w:t>
-      </w:r>
-      <w:r>
-        <w:t xml:space="preserve"> is mapped at the DTO boundary only.</w:t>
+        <w:t xml:space="preserve">isDeleted boolean</w:t>
+      </w:r>
+      <w:r>
+        <w:t xml:space="preserve"> is used directly (no active|inactive mapping).</w:t>
       </w:r>
     </w:p>
     <w:p>
@@ -299,7 +299,7 @@
           <w:b/>
           <w:bCs/>
         </w:rPr>
-        <w:t xml:space="preserve">referenced by id</w:t>
+        <w:t xml:space="preserve">referenced by code</w:t>
       </w:r>
       <w:r>
         <w:t xml:space="preserve"> and owned elsewhere.</w:t>
@@ -854,7 +854,7 @@
                 <w:sz w:val="20"/>
                 <w:szCs w:val="20"/>
               </w:rPr>
-              <w:t xml:space="preserve">classroomId</w:t>
+              <w:t xml:space="preserve">classroomCode</w:t>
             </w:r>
             <w:r>
               <w:t xml:space="preserve"> reference + read-only snapshot (</w:t>
@@ -967,7 +967,7 @@
                 <w:sz w:val="20"/>
                 <w:szCs w:val="20"/>
               </w:rPr>
-              <w:t xml:space="preserve">studentId</w:t>
+              <w:t xml:space="preserve">studentCode</w:t>
             </w:r>
             <w:r>
               <w:t xml:space="preserve"> reference + read-only snapshot (</w:t>
@@ -989,7 +989,7 @@
                 <w:sz w:val="20"/>
                 <w:szCs w:val="20"/>
               </w:rPr>
-              <w:t xml:space="preserve">classroomId</w:t>
+              <w:t xml:space="preserve">classroomCode</w:t>
             </w:r>
             <w:r>
               <w:t xml:space="preserve">, </w:t>
@@ -1011,7 +1011,7 @@
                 <w:sz w:val="20"/>
                 <w:szCs w:val="20"/>
               </w:rPr>
-              <w:t xml:space="preserve">status</w:t>
+              <w:t xml:space="preserve">isDeleted</w:t>
             </w:r>
             <w:r>
               <w:t xml:space="preserve">)</w:t>
@@ -1113,7 +1113,7 @@
                 <w:sz w:val="20"/>
                 <w:szCs w:val="20"/>
               </w:rPr>
-              <w:t xml:space="preserve">impersonatorId</w:t>
+              <w:t xml:space="preserve">impersonatorCode</w:t>
             </w:r>
             <w:r>
               <w:t xml:space="preserve"> references only</w:t>
@@ -1204,10 +1204,10 @@
                 <w:sz w:val="20"/>
                 <w:szCs w:val="20"/>
               </w:rPr>
-              <w:t xml:space="preserve">schoolId</w:t>
-            </w:r>
-            <w:r>
-              <w:t xml:space="preserve"> reference; drives row-level security</w:t>
+              <w:t xml:space="preserve">schoolCode</w:t>
+            </w:r>
+            <w:r>
+              <w:t xml:space="preserve"> / organizationCode reference; drives row-level security</w:t>
             </w:r>
           </w:p>
         </w:tc>
@@ -1233,7 +1233,7 @@
         <w:t xml:space="preserve">never</w:t>
       </w:r>
       <w:r>
-        <w:t xml:space="preserve"> copy-own classroom/student/user records. It stores their ids and validates scope via the RBAC service + </w:t>
+        <w:t xml:space="preserve"> copy-own classroom/student/user records. It stores their codes and validates scope via the RBAC service + </w:t>
       </w:r>
       <w:r>
         <w:rPr>
@@ -1241,7 +1241,7 @@
           <w:sz w:val="20"/>
           <w:szCs w:val="20"/>
         </w:rPr>
-        <w:t xml:space="preserve">X-School-Id</w:t>
+        <w:t xml:space="preserve">X-School-Code</w:t>
       </w:r>
       <w:r>
         <w:t xml:space="preserve">. The client receives lightweight reference snapshots (just the fields the UI needs) from whichever service exposes them.</w:t>
@@ -1332,7 +1332,18 @@
           <w:sz w:val="20"/>
           <w:szCs w:val="20"/>
         </w:rPr>
-        <w:t xml:space="preserve">schoolId</w:t>
+        <w:t xml:space="preserve">schoolCode</w:t>
+      </w:r>
+      <w:r>
+        <w:t xml:space="preserve"> / </w:t>
+      </w:r>
+      <w:r>
+        <w:rPr>
+          <w:rFonts w:ascii="Consolas" w:cs="Consolas" w:eastAsia="Consolas" w:hAnsi="Consolas"/>
+          <w:sz w:val="20"/>
+          <w:szCs w:val="20"/>
+        </w:rPr>
+        <w:t xml:space="preserve">organizationCode</w:t>
       </w:r>
       <w:r>
         <w:t xml:space="preserve"> (row-level security).</w:t>
@@ -1790,7 +1801,7 @@
               <w:spacing w:after="0" w:line="252"/>
             </w:pPr>
             <w:r>
-              <w:t xml:space="preserve">UUID[]</w:t>
+              <w:t xml:space="preserve">string[]</w:t>
             </w:r>
           </w:p>
         </w:tc>
@@ -1816,7 +1827,7 @@
               <w:spacing w:after="0" w:line="252"/>
             </w:pPr>
             <w:r>
-              <w:t xml:space="preserve">classroom ids this domain is scoped to</w:t>
+              <w:t xml:space="preserve">classroom codes this domain is scoped to</w:t>
             </w:r>
           </w:p>
         </w:tc>
@@ -1852,7 +1863,7 @@
                 <w:sz w:val="20"/>
                 <w:szCs w:val="20"/>
               </w:rPr>
-              <w:t xml:space="preserve">status</w:t>
+              <w:t xml:space="preserve">isDeleted</w:t>
             </w:r>
           </w:p>
         </w:tc>
@@ -1883,10 +1894,33 @@
                 <w:sz w:val="20"/>
                 <w:szCs w:val="20"/>
               </w:rPr>
-              <w:t xml:space="preserve">active</w:t>
-            </w:r>
-            <w:r>
-              <w:t xml:space="preserve"> | </w:t>
+              <w:t xml:space="preserve">boolean</w:t>
+            </w:r>
+          </w:p>
+        </w:tc>
+        <w:tc>
+          <w:tcPr>
+            <w:tcW w:type="dxa" w:w="5360"/>
+            <w:tcBorders>
+              <w:top w:val="single" w:color="B0B0B0" w:sz="1"/>
+              <w:left w:val="single" w:color="B0B0B0" w:sz="1"/>
+              <w:bottom w:val="single" w:color="B0B0B0" w:sz="1"/>
+              <w:right w:val="single" w:color="B0B0B0" w:sz="1"/>
+            </w:tcBorders>
+            <w:shd w:fill="FFFFFF" w:val="clear"/>
+            <w:tcMar>
+              <w:top w:type="dxa" w:w="60"/>
+              <w:left w:type="dxa" w:w="110"/>
+              <w:bottom w:type="dxa" w:w="60"/>
+              <w:right w:type="dxa" w:w="110"/>
+            </w:tcMar>
+          </w:tcPr>
+          <w:p>
+            <w:pPr>
+              <w:spacing w:after="0" w:line="252"/>
+            </w:pPr>
+            <w:r>
+              <w:t xml:space="preserve">soft-delete flag; true = deleted (was </w:t>
             </w:r>
             <w:r>
               <w:rPr>
@@ -1894,41 +1928,7 @@
                 <w:sz w:val="20"/>
                 <w:szCs w:val="20"/>
               </w:rPr>
-              <w:t xml:space="preserve">inactive</w:t>
-            </w:r>
-          </w:p>
-        </w:tc>
-        <w:tc>
-          <w:tcPr>
-            <w:tcW w:type="dxa" w:w="5360"/>
-            <w:tcBorders>
-              <w:top w:val="single" w:color="B0B0B0" w:sz="1"/>
-              <w:left w:val="single" w:color="B0B0B0" w:sz="1"/>
-              <w:bottom w:val="single" w:color="B0B0B0" w:sz="1"/>
-              <w:right w:val="single" w:color="B0B0B0" w:sz="1"/>
-            </w:tcBorders>
-            <w:shd w:fill="FFFFFF" w:val="clear"/>
-            <w:tcMar>
-              <w:top w:type="dxa" w:w="60"/>
-              <w:left w:type="dxa" w:w="110"/>
-              <w:bottom w:type="dxa" w:w="60"/>
-              <w:right w:type="dxa" w:w="110"/>
-            </w:tcMar>
-          </w:tcPr>
-          <w:p>
-            <w:pPr>
-              <w:spacing w:after="0" w:line="252"/>
-            </w:pPr>
-            <w:r>
-              <w:t xml:space="preserve">soft-delete; client maps to </w:t>
-            </w:r>
-            <w:r>
-              <w:rPr>
-                <w:rFonts w:ascii="Consolas" w:cs="Consolas" w:eastAsia="Consolas" w:hAnsi="Consolas"/>
-                <w:sz w:val="20"/>
-                <w:szCs w:val="20"/>
-              </w:rPr>
-              <w:t xml:space="preserve">bool active</w:t>
+              <w:t xml:space="preserve">status active|inactive)</w:t>
             </w:r>
           </w:p>
         </w:tc>
@@ -1964,7 +1964,7 @@
                 <w:sz w:val="20"/>
                 <w:szCs w:val="20"/>
               </w:rPr>
-              <w:t xml:space="preserve">schoolId</w:t>
+              <w:t xml:space="preserve">schoolCode</w:t>
             </w:r>
           </w:p>
         </w:tc>
@@ -1990,7 +1990,7 @@
               <w:spacing w:after="0" w:line="252"/>
             </w:pPr>
             <w:r>
-              <w:t xml:space="preserve">UUID</w:t>
+              <w:t xml:space="preserve">string</w:t>
             </w:r>
           </w:p>
         </w:tc>
@@ -2034,7 +2034,7 @@
               <w:bottom w:val="single" w:color="B0B0B0" w:sz="1"/>
               <w:right w:val="single" w:color="B0B0B0" w:sz="1"/>
             </w:tcBorders>
-            <w:shd w:fill="FFFFFF" w:val="clear"/>
+            <w:shd w:fill="F2F6FA" w:val="clear"/>
             <w:tcMar>
               <w:top w:type="dxa" w:w="60"/>
               <w:left w:type="dxa" w:w="110"/>
@@ -2052,17 +2052,105 @@
                 <w:sz w:val="20"/>
                 <w:szCs w:val="20"/>
               </w:rPr>
-              <w:t xml:space="preserve">createdBy</w:t>
-            </w:r>
-            <w:r>
-              <w:t xml:space="preserve"> / </w:t>
-            </w:r>
+              <w:t xml:space="preserve">organizationCode</w:t>
+            </w:r>
+          </w:p>
+        </w:tc>
+        <w:tc>
+          <w:tcPr>
+            <w:tcW w:type="dxa" w:w="1800"/>
+            <w:tcBorders>
+              <w:top w:val="single" w:color="B0B0B0" w:sz="1"/>
+              <w:left w:val="single" w:color="B0B0B0" w:sz="1"/>
+              <w:bottom w:val="single" w:color="B0B0B0" w:sz="1"/>
+              <w:right w:val="single" w:color="B0B0B0" w:sz="1"/>
+            </w:tcBorders>
+            <w:shd w:fill="F2F6FA" w:val="clear"/>
+            <w:tcMar>
+              <w:top w:type="dxa" w:w="60"/>
+              <w:left w:type="dxa" w:w="110"/>
+              <w:bottom w:type="dxa" w:w="60"/>
+              <w:right w:type="dxa" w:w="110"/>
+            </w:tcMar>
+          </w:tcPr>
+          <w:p>
+            <w:pPr>
+              <w:spacing w:after="0" w:line="252"/>
+            </w:pPr>
+            <w:r>
+              <w:t xml:space="preserve">string</w:t>
+            </w:r>
+          </w:p>
+        </w:tc>
+        <w:tc>
+          <w:tcPr>
+            <w:tcW w:type="dxa" w:w="5360"/>
+            <w:tcBorders>
+              <w:top w:val="single" w:color="B0B0B0" w:sz="1"/>
+              <w:left w:val="single" w:color="B0B0B0" w:sz="1"/>
+              <w:bottom w:val="single" w:color="B0B0B0" w:sz="1"/>
+              <w:right w:val="single" w:color="B0B0B0" w:sz="1"/>
+            </w:tcBorders>
+            <w:shd w:fill="F2F6FA" w:val="clear"/>
+            <w:tcMar>
+              <w:top w:type="dxa" w:w="60"/>
+              <w:left w:type="dxa" w:w="110"/>
+              <w:bottom w:type="dxa" w:w="60"/>
+              <w:right w:type="dxa" w:w="110"/>
+            </w:tcMar>
+          </w:tcPr>
+          <w:p>
+            <w:pPr>
+              <w:spacing w:after="0" w:line="252"/>
+            </w:pPr>
+            <w:r>
+              <w:t xml:space="preserve">RLS scope (organization that owns the school)</w:t>
+            </w:r>
+          </w:p>
+        </w:tc>
+      </w:tr>
+      <w:tr>
+        <w:trPr>
+          <w:tblHeader w:val="false"/>
+        </w:trPr>
+        <w:tc>
+          <w:tcPr>
+            <w:tcW w:type="dxa" w:w="2200"/>
+            <w:tcBorders>
+              <w:top w:val="single" w:color="B0B0B0" w:sz="1"/>
+              <w:left w:val="single" w:color="B0B0B0" w:sz="1"/>
+              <w:bottom w:val="single" w:color="B0B0B0" w:sz="1"/>
+              <w:right w:val="single" w:color="B0B0B0" w:sz="1"/>
+            </w:tcBorders>
+            <w:shd w:fill="FFFFFF" w:val="clear"/>
+            <w:tcMar>
+              <w:top w:type="dxa" w:w="60"/>
+              <w:left w:type="dxa" w:w="110"/>
+              <w:bottom w:type="dxa" w:w="60"/>
+              <w:right w:type="dxa" w:w="110"/>
+            </w:tcMar>
+          </w:tcPr>
+          <w:p>
+            <w:pPr>
+              <w:spacing w:after="0" w:line="252"/>
+            </w:pPr>
             <w:r>
               <w:rPr>
                 <w:rFonts w:ascii="Consolas" w:cs="Consolas" w:eastAsia="Consolas" w:hAnsi="Consolas"/>
                 <w:sz w:val="20"/>
                 <w:szCs w:val="20"/>
               </w:rPr>
+              <w:t xml:space="preserve">createdBy</w:t>
+            </w:r>
+            <w:r>
+              <w:t xml:space="preserve"> / </w:t>
+            </w:r>
+            <w:r>
+              <w:rPr>
+                <w:rFonts w:ascii="Consolas" w:cs="Consolas" w:eastAsia="Consolas" w:hAnsi="Consolas"/>
+                <w:sz w:val="20"/>
+                <w:szCs w:val="20"/>
+              </w:rPr>
               <w:t xml:space="preserve">updatedBy</w:t>
             </w:r>
           </w:p>
@@ -2089,7 +2177,7 @@
               <w:spacing w:after="0" w:line="252"/>
             </w:pPr>
             <w:r>
-              <w:t xml:space="preserve">UUID (User)</w:t>
+              <w:t xml:space="preserve">string (User code)</w:t>
             </w:r>
           </w:p>
         </w:tc>
@@ -2774,7 +2862,7 @@
               <w:spacing w:after="0" w:line="252"/>
             </w:pPr>
             <w:r>
-              <w:t xml:space="preserve">UUID[]</w:t>
+              <w:t xml:space="preserve">string[]</w:t>
             </w:r>
           </w:p>
         </w:tc>
@@ -2800,7 +2888,7 @@
               <w:spacing w:after="0" w:line="252"/>
             </w:pPr>
             <w:r>
-              <w:t xml:space="preserve">classroom ids</w:t>
+              <w:t xml:space="preserve">classroom codes</w:t>
             </w:r>
           </w:p>
         </w:tc>
@@ -2836,7 +2924,7 @@
                 <w:sz w:val="20"/>
                 <w:szCs w:val="20"/>
               </w:rPr>
-              <w:t xml:space="preserve">status</w:t>
+              <w:t xml:space="preserve">isDeleted</w:t>
             </w:r>
           </w:p>
         </w:tc>
@@ -2867,18 +2955,7 @@
                 <w:sz w:val="20"/>
                 <w:szCs w:val="20"/>
               </w:rPr>
-              <w:t xml:space="preserve">active</w:t>
-            </w:r>
-            <w:r>
-              <w:t xml:space="preserve"> | </w:t>
-            </w:r>
-            <w:r>
-              <w:rPr>
-                <w:rFonts w:ascii="Consolas" w:cs="Consolas" w:eastAsia="Consolas" w:hAnsi="Consolas"/>
-                <w:sz w:val="20"/>
-                <w:szCs w:val="20"/>
-              </w:rPr>
-              <w:t xml:space="preserve">inactive</w:t>
+              <w:t xml:space="preserve">boolean</w:t>
             </w:r>
           </w:p>
         </w:tc>
@@ -2940,7 +3017,7 @@
                 <w:sz w:val="20"/>
                 <w:szCs w:val="20"/>
               </w:rPr>
-              <w:t xml:space="preserve">schoolId</w:t>
+              <w:t xml:space="preserve">schoolCode</w:t>
             </w:r>
           </w:p>
         </w:tc>
@@ -2966,7 +3043,7 @@
               <w:spacing w:after="0" w:line="252"/>
             </w:pPr>
             <w:r>
-              <w:t xml:space="preserve">UUID</w:t>
+              <w:t xml:space="preserve">string</w:t>
             </w:r>
           </w:p>
         </w:tc>
@@ -3010,7 +3087,7 @@
               <w:bottom w:val="single" w:color="B0B0B0" w:sz="1"/>
               <w:right w:val="single" w:color="B0B0B0" w:sz="1"/>
             </w:tcBorders>
-            <w:shd w:fill="FFFFFF" w:val="clear"/>
+            <w:shd w:fill="F2F6FA" w:val="clear"/>
             <w:tcMar>
               <w:top w:type="dxa" w:w="60"/>
               <w:left w:type="dxa" w:w="110"/>
@@ -3028,17 +3105,105 @@
                 <w:sz w:val="20"/>
                 <w:szCs w:val="20"/>
               </w:rPr>
-              <w:t xml:space="preserve">createdBy</w:t>
-            </w:r>
-            <w:r>
-              <w:t xml:space="preserve"> / </w:t>
-            </w:r>
+              <w:t xml:space="preserve">organizationCode</w:t>
+            </w:r>
+          </w:p>
+        </w:tc>
+        <w:tc>
+          <w:tcPr>
+            <w:tcW w:type="dxa" w:w="1800"/>
+            <w:tcBorders>
+              <w:top w:val="single" w:color="B0B0B0" w:sz="1"/>
+              <w:left w:val="single" w:color="B0B0B0" w:sz="1"/>
+              <w:bottom w:val="single" w:color="B0B0B0" w:sz="1"/>
+              <w:right w:val="single" w:color="B0B0B0" w:sz="1"/>
+            </w:tcBorders>
+            <w:shd w:fill="F2F6FA" w:val="clear"/>
+            <w:tcMar>
+              <w:top w:type="dxa" w:w="60"/>
+              <w:left w:type="dxa" w:w="110"/>
+              <w:bottom w:type="dxa" w:w="60"/>
+              <w:right w:type="dxa" w:w="110"/>
+            </w:tcMar>
+          </w:tcPr>
+          <w:p>
+            <w:pPr>
+              <w:spacing w:after="0" w:line="252"/>
+            </w:pPr>
+            <w:r>
+              <w:t xml:space="preserve">string</w:t>
+            </w:r>
+          </w:p>
+        </w:tc>
+        <w:tc>
+          <w:tcPr>
+            <w:tcW w:type="dxa" w:w="5360"/>
+            <w:tcBorders>
+              <w:top w:val="single" w:color="B0B0B0" w:sz="1"/>
+              <w:left w:val="single" w:color="B0B0B0" w:sz="1"/>
+              <w:bottom w:val="single" w:color="B0B0B0" w:sz="1"/>
+              <w:right w:val="single" w:color="B0B0B0" w:sz="1"/>
+            </w:tcBorders>
+            <w:shd w:fill="F2F6FA" w:val="clear"/>
+            <w:tcMar>
+              <w:top w:type="dxa" w:w="60"/>
+              <w:left w:type="dxa" w:w="110"/>
+              <w:bottom w:type="dxa" w:w="60"/>
+              <w:right w:type="dxa" w:w="110"/>
+            </w:tcMar>
+          </w:tcPr>
+          <w:p>
+            <w:pPr>
+              <w:spacing w:after="0" w:line="252"/>
+            </w:pPr>
+            <w:r>
+              <w:t xml:space="preserve">RLS scope (organization that owns the school)</w:t>
+            </w:r>
+          </w:p>
+        </w:tc>
+      </w:tr>
+      <w:tr>
+        <w:trPr>
+          <w:tblHeader w:val="false"/>
+        </w:trPr>
+        <w:tc>
+          <w:tcPr>
+            <w:tcW w:type="dxa" w:w="2200"/>
+            <w:tcBorders>
+              <w:top w:val="single" w:color="B0B0B0" w:sz="1"/>
+              <w:left w:val="single" w:color="B0B0B0" w:sz="1"/>
+              <w:bottom w:val="single" w:color="B0B0B0" w:sz="1"/>
+              <w:right w:val="single" w:color="B0B0B0" w:sz="1"/>
+            </w:tcBorders>
+            <w:shd w:fill="FFFFFF" w:val="clear"/>
+            <w:tcMar>
+              <w:top w:type="dxa" w:w="60"/>
+              <w:left w:type="dxa" w:w="110"/>
+              <w:bottom w:type="dxa" w:w="60"/>
+              <w:right w:type="dxa" w:w="110"/>
+            </w:tcMar>
+          </w:tcPr>
+          <w:p>
+            <w:pPr>
+              <w:spacing w:after="0" w:line="252"/>
+            </w:pPr>
             <w:r>
               <w:rPr>
                 <w:rFonts w:ascii="Consolas" w:cs="Consolas" w:eastAsia="Consolas" w:hAnsi="Consolas"/>
                 <w:sz w:val="20"/>
                 <w:szCs w:val="20"/>
               </w:rPr>
+              <w:t xml:space="preserve">createdBy</w:t>
+            </w:r>
+            <w:r>
+              <w:t xml:space="preserve"> / </w:t>
+            </w:r>
+            <w:r>
+              <w:rPr>
+                <w:rFonts w:ascii="Consolas" w:cs="Consolas" w:eastAsia="Consolas" w:hAnsi="Consolas"/>
+                <w:sz w:val="20"/>
+                <w:szCs w:val="20"/>
+              </w:rPr>
               <w:t xml:space="preserve">updatedBy</w:t>
             </w:r>
           </w:p>
@@ -3065,7 +3230,7 @@
               <w:spacing w:after="0" w:line="252"/>
             </w:pPr>
             <w:r>
-              <w:t xml:space="preserve">UUID</w:t>
+              <w:t xml:space="preserve">string (User code)</w:t>
             </w:r>
           </w:p>
         </w:tc>
@@ -4050,7 +4215,7 @@
               <w:spacing w:after="0" w:line="252"/>
             </w:pPr>
             <w:r>
-              <w:t xml:space="preserve">UUID[]</w:t>
+              <w:t xml:space="preserve">string[]</w:t>
             </w:r>
           </w:p>
         </w:tc>
@@ -4080,7 +4245,7 @@
                 <w:b/>
                 <w:bCs/>
               </w:rPr>
-              <w:t xml:space="preserve">classroom ids</w:t>
+              <w:t xml:space="preserve">classroom codes</w:t>
             </w:r>
             <w:r>
               <w:t xml:space="preserve">; empty array is valid (“no classrooms assigned” badge)</w:t>
@@ -4119,7 +4284,7 @@
                 <w:sz w:val="20"/>
                 <w:szCs w:val="20"/>
               </w:rPr>
-              <w:t xml:space="preserve">status</w:t>
+              <w:t xml:space="preserve">isDeleted</w:t>
             </w:r>
           </w:p>
         </w:tc>
@@ -4150,18 +4315,7 @@
                 <w:sz w:val="20"/>
                 <w:szCs w:val="20"/>
               </w:rPr>
-              <w:t xml:space="preserve">active</w:t>
-            </w:r>
-            <w:r>
-              <w:t xml:space="preserve"> | </w:t>
-            </w:r>
-            <w:r>
-              <w:rPr>
-                <w:rFonts w:ascii="Consolas" w:cs="Consolas" w:eastAsia="Consolas" w:hAnsi="Consolas"/>
-                <w:sz w:val="20"/>
-                <w:szCs w:val="20"/>
-              </w:rPr>
-              <w:t xml:space="preserve">inactive</w:t>
+              <w:t xml:space="preserve">boolean</w:t>
             </w:r>
           </w:p>
         </w:tc>
@@ -4223,7 +4377,7 @@
                 <w:sz w:val="20"/>
                 <w:szCs w:val="20"/>
               </w:rPr>
-              <w:t xml:space="preserve">schoolId</w:t>
+              <w:t xml:space="preserve">schoolCode</w:t>
             </w:r>
           </w:p>
         </w:tc>
@@ -4249,7 +4403,7 @@
               <w:spacing w:after="0" w:line="252"/>
             </w:pPr>
             <w:r>
-              <w:t xml:space="preserve">UUID</w:t>
+              <w:t xml:space="preserve">string</w:t>
             </w:r>
           </w:p>
         </w:tc>
@@ -4311,17 +4465,105 @@
                 <w:sz w:val="20"/>
                 <w:szCs w:val="20"/>
               </w:rPr>
-              <w:t xml:space="preserve">createdBy</w:t>
-            </w:r>
-            <w:r>
-              <w:t xml:space="preserve"> / </w:t>
-            </w:r>
+              <w:t xml:space="preserve">organizationCode</w:t>
+            </w:r>
+          </w:p>
+        </w:tc>
+        <w:tc>
+          <w:tcPr>
+            <w:tcW w:type="dxa" w:w="1800"/>
+            <w:tcBorders>
+              <w:top w:val="single" w:color="B0B0B0" w:sz="1"/>
+              <w:left w:val="single" w:color="B0B0B0" w:sz="1"/>
+              <w:bottom w:val="single" w:color="B0B0B0" w:sz="1"/>
+              <w:right w:val="single" w:color="B0B0B0" w:sz="1"/>
+            </w:tcBorders>
+            <w:shd w:fill="F2F6FA" w:val="clear"/>
+            <w:tcMar>
+              <w:top w:type="dxa" w:w="60"/>
+              <w:left w:type="dxa" w:w="110"/>
+              <w:bottom w:type="dxa" w:w="60"/>
+              <w:right w:type="dxa" w:w="110"/>
+            </w:tcMar>
+          </w:tcPr>
+          <w:p>
+            <w:pPr>
+              <w:spacing w:after="0" w:line="252"/>
+            </w:pPr>
+            <w:r>
+              <w:t xml:space="preserve">string</w:t>
+            </w:r>
+          </w:p>
+        </w:tc>
+        <w:tc>
+          <w:tcPr>
+            <w:tcW w:type="dxa" w:w="5360"/>
+            <w:tcBorders>
+              <w:top w:val="single" w:color="B0B0B0" w:sz="1"/>
+              <w:left w:val="single" w:color="B0B0B0" w:sz="1"/>
+              <w:bottom w:val="single" w:color="B0B0B0" w:sz="1"/>
+              <w:right w:val="single" w:color="B0B0B0" w:sz="1"/>
+            </w:tcBorders>
+            <w:shd w:fill="F2F6FA" w:val="clear"/>
+            <w:tcMar>
+              <w:top w:type="dxa" w:w="60"/>
+              <w:left w:type="dxa" w:w="110"/>
+              <w:bottom w:type="dxa" w:w="60"/>
+              <w:right w:type="dxa" w:w="110"/>
+            </w:tcMar>
+          </w:tcPr>
+          <w:p>
+            <w:pPr>
+              <w:spacing w:after="0" w:line="252"/>
+            </w:pPr>
+            <w:r>
+              <w:t xml:space="preserve">RLS scope (organization that owns the school)</w:t>
+            </w:r>
+          </w:p>
+        </w:tc>
+      </w:tr>
+      <w:tr>
+        <w:trPr>
+          <w:tblHeader w:val="false"/>
+        </w:trPr>
+        <w:tc>
+          <w:tcPr>
+            <w:tcW w:type="dxa" w:w="2200"/>
+            <w:tcBorders>
+              <w:top w:val="single" w:color="B0B0B0" w:sz="1"/>
+              <w:left w:val="single" w:color="B0B0B0" w:sz="1"/>
+              <w:bottom w:val="single" w:color="B0B0B0" w:sz="1"/>
+              <w:right w:val="single" w:color="B0B0B0" w:sz="1"/>
+            </w:tcBorders>
+            <w:shd w:fill="F2F6FA" w:val="clear"/>
+            <w:tcMar>
+              <w:top w:type="dxa" w:w="60"/>
+              <w:left w:type="dxa" w:w="110"/>
+              <w:bottom w:type="dxa" w:w="60"/>
+              <w:right w:type="dxa" w:w="110"/>
+            </w:tcMar>
+          </w:tcPr>
+          <w:p>
+            <w:pPr>
+              <w:spacing w:after="0" w:line="252"/>
+            </w:pPr>
             <w:r>
               <w:rPr>
                 <w:rFonts w:ascii="Consolas" w:cs="Consolas" w:eastAsia="Consolas" w:hAnsi="Consolas"/>
                 <w:sz w:val="20"/>
                 <w:szCs w:val="20"/>
               </w:rPr>
+              <w:t xml:space="preserve">createdBy</w:t>
+            </w:r>
+            <w:r>
+              <w:t xml:space="preserve"> / </w:t>
+            </w:r>
+            <w:r>
+              <w:rPr>
+                <w:rFonts w:ascii="Consolas" w:cs="Consolas" w:eastAsia="Consolas" w:hAnsi="Consolas"/>
+                <w:sz w:val="20"/>
+                <w:szCs w:val="20"/>
+              </w:rPr>
               <w:t xml:space="preserve">updatedBy</w:t>
             </w:r>
           </w:p>
@@ -4348,7 +4590,7 @@
               <w:spacing w:after="0" w:line="252"/>
             </w:pPr>
             <w:r>
-              <w:t xml:space="preserve">UUID</w:t>
+              <w:t xml:space="preserve">string (User code)</w:t>
             </w:r>
           </w:p>
         </w:tc>
@@ -4729,7 +4971,7 @@
                 <w:sz w:val="20"/>
                 <w:szCs w:val="20"/>
               </w:rPr>
-              <w:t xml:space="preserve">studentId</w:t>
+              <w:t xml:space="preserve">studentCode</w:t>
             </w:r>
           </w:p>
         </w:tc>
@@ -4755,7 +4997,7 @@
               <w:spacing w:after="0" w:line="252"/>
             </w:pPr>
             <w:r>
-              <w:t xml:space="preserve">UUID (FK Student)</w:t>
+              <w:t xml:space="preserve">string (FK Student)</w:t>
             </w:r>
           </w:p>
         </w:tc>
@@ -5186,7 +5428,7 @@
                 <w:sz w:val="20"/>
                 <w:szCs w:val="20"/>
               </w:rPr>
-              <w:t xml:space="preserve">notes</w:t>
+              <w:t xml:space="preserve">isPublished</w:t>
             </w:r>
           </w:p>
         </w:tc>
@@ -5212,7 +5454,7 @@
               <w:spacing w:after="0" w:line="252"/>
             </w:pPr>
             <w:r>
-              <w:t xml:space="preserve">string?</w:t>
+              <w:t xml:space="preserve">boolean</w:t>
             </w:r>
           </w:p>
         </w:tc>
@@ -5238,7 +5480,7 @@
               <w:spacing w:after="0" w:line="252"/>
             </w:pPr>
             <w:r>
-              <w:t xml:space="preserve">optional, max 500 chars (VR-AS-03)</w:t>
+              <w:t xml:space="preserve">publish flag; true = score is visible to parents (default false)</w:t>
             </w:r>
           </w:p>
         </w:tc>
@@ -5256,7 +5498,7 @@
               <w:bottom w:val="single" w:color="B0B0B0" w:sz="1"/>
               <w:right w:val="single" w:color="B0B0B0" w:sz="1"/>
             </w:tcBorders>
-            <w:shd w:fill="F2F6FA" w:val="clear"/>
+            <w:shd w:fill="FFFFFF" w:val="clear"/>
             <w:tcMar>
               <w:top w:type="dxa" w:w="60"/>
               <w:left w:type="dxa" w:w="110"/>
@@ -5274,7 +5516,7 @@
                 <w:sz w:val="20"/>
                 <w:szCs w:val="20"/>
               </w:rPr>
-              <w:t xml:space="preserve">assessedBy</w:t>
+              <w:t xml:space="preserve">notes</w:t>
             </w:r>
           </w:p>
         </w:tc>
@@ -5287,20 +5529,20 @@
               <w:bottom w:val="single" w:color="B0B0B0" w:sz="1"/>
               <w:right w:val="single" w:color="B0B0B0" w:sz="1"/>
             </w:tcBorders>
-            <w:shd w:fill="F2F6FA" w:val="clear"/>
-            <w:tcMar>
-              <w:top w:type="dxa" w:w="60"/>
-              <w:left w:type="dxa" w:w="110"/>
-              <w:bottom w:type="dxa" w:w="60"/>
-              <w:right w:type="dxa" w:w="110"/>
-            </w:tcMar>
-          </w:tcPr>
-          <w:p>
-            <w:pPr>
-              <w:spacing w:after="0" w:line="252"/>
-            </w:pPr>
-            <w:r>
-              <w:t xml:space="preserve">UUID (User)</w:t>
+            <w:shd w:fill="FFFFFF" w:val="clear"/>
+            <w:tcMar>
+              <w:top w:type="dxa" w:w="60"/>
+              <w:left w:type="dxa" w:w="110"/>
+              <w:bottom w:type="dxa" w:w="60"/>
+              <w:right w:type="dxa" w:w="110"/>
+            </w:tcMar>
+          </w:tcPr>
+          <w:p>
+            <w:pPr>
+              <w:spacing w:after="0" w:line="252"/>
+            </w:pPr>
+            <w:r>
+              <w:t xml:space="preserve">string?</w:t>
             </w:r>
           </w:p>
         </w:tc>
@@ -5313,27 +5555,20 @@
               <w:bottom w:val="single" w:color="B0B0B0" w:sz="1"/>
               <w:right w:val="single" w:color="B0B0B0" w:sz="1"/>
             </w:tcBorders>
-            <w:shd w:fill="F2F6FA" w:val="clear"/>
-            <w:tcMar>
-              <w:top w:type="dxa" w:w="60"/>
-              <w:left w:type="dxa" w:w="110"/>
-              <w:bottom w:type="dxa" w:w="60"/>
-              <w:right w:type="dxa" w:w="110"/>
-            </w:tcMar>
-          </w:tcPr>
-          <w:p>
-            <w:pPr>
-              <w:spacing w:after="0" w:line="252"/>
-            </w:pPr>
-            <w:r>
-              <w:rPr>
-                <w:b/>
-                <w:bCs/>
-              </w:rPr>
-              <w:t xml:space="preserve">server-derived from JWT</w:t>
-            </w:r>
-            <w:r>
-              <w:t xml:space="preserve">, not client-asserted</w:t>
+            <w:shd w:fill="FFFFFF" w:val="clear"/>
+            <w:tcMar>
+              <w:top w:type="dxa" w:w="60"/>
+              <w:left w:type="dxa" w:w="110"/>
+              <w:bottom w:type="dxa" w:w="60"/>
+              <w:right w:type="dxa" w:w="110"/>
+            </w:tcMar>
+          </w:tcPr>
+          <w:p>
+            <w:pPr>
+              <w:spacing w:after="0" w:line="252"/>
+            </w:pPr>
+            <w:r>
+              <w:t xml:space="preserve">optional, max 500 chars (VR-AS-03)</w:t>
             </w:r>
           </w:p>
         </w:tc>
@@ -5351,7 +5586,7 @@
               <w:bottom w:val="single" w:color="B0B0B0" w:sz="1"/>
               <w:right w:val="single" w:color="B0B0B0" w:sz="1"/>
             </w:tcBorders>
-            <w:shd w:fill="FFFFFF" w:val="clear"/>
+            <w:shd w:fill="F2F6FA" w:val="clear"/>
             <w:tcMar>
               <w:top w:type="dxa" w:w="60"/>
               <w:left w:type="dxa" w:w="110"/>
@@ -5369,7 +5604,7 @@
                 <w:sz w:val="20"/>
                 <w:szCs w:val="20"/>
               </w:rPr>
-              <w:t xml:space="preserve">assessedAt</w:t>
+              <w:t xml:space="preserve">assessedBy</w:t>
             </w:r>
           </w:p>
         </w:tc>
@@ -5382,20 +5617,20 @@
               <w:bottom w:val="single" w:color="B0B0B0" w:sz="1"/>
               <w:right w:val="single" w:color="B0B0B0" w:sz="1"/>
             </w:tcBorders>
-            <w:shd w:fill="FFFFFF" w:val="clear"/>
-            <w:tcMar>
-              <w:top w:type="dxa" w:w="60"/>
-              <w:left w:type="dxa" w:w="110"/>
-              <w:bottom w:type="dxa" w:w="60"/>
-              <w:right w:type="dxa" w:w="110"/>
-            </w:tcMar>
-          </w:tcPr>
-          <w:p>
-            <w:pPr>
-              <w:spacing w:after="0" w:line="252"/>
-            </w:pPr>
-            <w:r>
-              <w:t xml:space="preserve">timestamp</w:t>
+            <w:shd w:fill="F2F6FA" w:val="clear"/>
+            <w:tcMar>
+              <w:top w:type="dxa" w:w="60"/>
+              <w:left w:type="dxa" w:w="110"/>
+              <w:bottom w:type="dxa" w:w="60"/>
+              <w:right w:type="dxa" w:w="110"/>
+            </w:tcMar>
+          </w:tcPr>
+          <w:p>
+            <w:pPr>
+              <w:spacing w:after="0" w:line="252"/>
+            </w:pPr>
+            <w:r>
+              <w:t xml:space="preserve">string (User code)</w:t>
             </w:r>
           </w:p>
         </w:tc>
@@ -5408,20 +5643,27 @@
               <w:bottom w:val="single" w:color="B0B0B0" w:sz="1"/>
               <w:right w:val="single" w:color="B0B0B0" w:sz="1"/>
             </w:tcBorders>
-            <w:shd w:fill="FFFFFF" w:val="clear"/>
-            <w:tcMar>
-              <w:top w:type="dxa" w:w="60"/>
-              <w:left w:type="dxa" w:w="110"/>
-              <w:bottom w:type="dxa" w:w="60"/>
-              <w:right w:type="dxa" w:w="110"/>
-            </w:tcMar>
-          </w:tcPr>
-          <w:p>
-            <w:pPr>
-              <w:spacing w:after="0" w:line="252"/>
-            </w:pPr>
-            <w:r>
-              <w:t xml:space="preserve">server-set</w:t>
+            <w:shd w:fill="F2F6FA" w:val="clear"/>
+            <w:tcMar>
+              <w:top w:type="dxa" w:w="60"/>
+              <w:left w:type="dxa" w:w="110"/>
+              <w:bottom w:type="dxa" w:w="60"/>
+              <w:right w:type="dxa" w:w="110"/>
+            </w:tcMar>
+          </w:tcPr>
+          <w:p>
+            <w:pPr>
+              <w:spacing w:after="0" w:line="252"/>
+            </w:pPr>
+            <w:r>
+              <w:rPr>
+                <w:b/>
+                <w:bCs/>
+              </w:rPr>
+              <w:t xml:space="preserve">server-derived from JWT</w:t>
+            </w:r>
+            <w:r>
+              <w:t xml:space="preserve">, not client-asserted</w:t>
             </w:r>
           </w:p>
         </w:tc>
@@ -5439,7 +5681,7 @@
               <w:bottom w:val="single" w:color="B0B0B0" w:sz="1"/>
               <w:right w:val="single" w:color="B0B0B0" w:sz="1"/>
             </w:tcBorders>
-            <w:shd w:fill="F2F6FA" w:val="clear"/>
+            <w:shd w:fill="FFFFFF" w:val="clear"/>
             <w:tcMar>
               <w:top w:type="dxa" w:w="60"/>
               <w:left w:type="dxa" w:w="110"/>
@@ -5457,7 +5699,7 @@
                 <w:sz w:val="20"/>
                 <w:szCs w:val="20"/>
               </w:rPr>
-              <w:t xml:space="preserve">periodStart</w:t>
+              <w:t xml:space="preserve">assessedAt</w:t>
             </w:r>
           </w:p>
         </w:tc>
@@ -5470,20 +5712,20 @@
               <w:bottom w:val="single" w:color="B0B0B0" w:sz="1"/>
               <w:right w:val="single" w:color="B0B0B0" w:sz="1"/>
             </w:tcBorders>
-            <w:shd w:fill="F2F6FA" w:val="clear"/>
-            <w:tcMar>
-              <w:top w:type="dxa" w:w="60"/>
-              <w:left w:type="dxa" w:w="110"/>
-              <w:bottom w:type="dxa" w:w="60"/>
-              <w:right w:type="dxa" w:w="110"/>
-            </w:tcMar>
-          </w:tcPr>
-          <w:p>
-            <w:pPr>
-              <w:spacing w:after="0" w:line="252"/>
-            </w:pPr>
-            <w:r>
-              <w:t xml:space="preserve">date</w:t>
+            <w:shd w:fill="FFFFFF" w:val="clear"/>
+            <w:tcMar>
+              <w:top w:type="dxa" w:w="60"/>
+              <w:left w:type="dxa" w:w="110"/>
+              <w:bottom w:type="dxa" w:w="60"/>
+              <w:right w:type="dxa" w:w="110"/>
+            </w:tcMar>
+          </w:tcPr>
+          <w:p>
+            <w:pPr>
+              <w:spacing w:after="0" w:line="252"/>
+            </w:pPr>
+            <w:r>
+              <w:t xml:space="preserve">timestamp</w:t>
             </w:r>
           </w:p>
         </w:tc>
@@ -5496,20 +5738,20 @@
               <w:bottom w:val="single" w:color="B0B0B0" w:sz="1"/>
               <w:right w:val="single" w:color="B0B0B0" w:sz="1"/>
             </w:tcBorders>
-            <w:shd w:fill="F2F6FA" w:val="clear"/>
-            <w:tcMar>
-              <w:top w:type="dxa" w:w="60"/>
-              <w:left w:type="dxa" w:w="110"/>
-              <w:bottom w:type="dxa" w:w="60"/>
-              <w:right w:type="dxa" w:w="110"/>
-            </w:tcMar>
-          </w:tcPr>
-          <w:p>
-            <w:pPr>
-              <w:spacing w:after="0" w:line="252"/>
-            </w:pPr>
-            <w:r>
-              <w:t xml:space="preserve">first day of month, UTC</w:t>
+            <w:shd w:fill="FFFFFF" w:val="clear"/>
+            <w:tcMar>
+              <w:top w:type="dxa" w:w="60"/>
+              <w:left w:type="dxa" w:w="110"/>
+              <w:bottom w:type="dxa" w:w="60"/>
+              <w:right w:type="dxa" w:w="110"/>
+            </w:tcMar>
+          </w:tcPr>
+          <w:p>
+            <w:pPr>
+              <w:spacing w:after="0" w:line="252"/>
+            </w:pPr>
+            <w:r>
+              <w:t xml:space="preserve">server-set</w:t>
             </w:r>
           </w:p>
         </w:tc>
@@ -5527,7 +5769,7 @@
               <w:bottom w:val="single" w:color="B0B0B0" w:sz="1"/>
               <w:right w:val="single" w:color="B0B0B0" w:sz="1"/>
             </w:tcBorders>
-            <w:shd w:fill="FFFFFF" w:val="clear"/>
+            <w:shd w:fill="F2F6FA" w:val="clear"/>
             <w:tcMar>
               <w:top w:type="dxa" w:w="60"/>
               <w:left w:type="dxa" w:w="110"/>
@@ -5545,7 +5787,7 @@
                 <w:sz w:val="20"/>
                 <w:szCs w:val="20"/>
               </w:rPr>
-              <w:t xml:space="preserve">periodEnd</w:t>
+              <w:t xml:space="preserve">periodStart</w:t>
             </w:r>
           </w:p>
         </w:tc>
@@ -5558,7 +5800,7 @@
               <w:bottom w:val="single" w:color="B0B0B0" w:sz="1"/>
               <w:right w:val="single" w:color="B0B0B0" w:sz="1"/>
             </w:tcBorders>
-            <w:shd w:fill="FFFFFF" w:val="clear"/>
+            <w:shd w:fill="F2F6FA" w:val="clear"/>
             <w:tcMar>
               <w:top w:type="dxa" w:w="60"/>
               <w:left w:type="dxa" w:w="110"/>
@@ -5584,20 +5826,20 @@
               <w:bottom w:val="single" w:color="B0B0B0" w:sz="1"/>
               <w:right w:val="single" w:color="B0B0B0" w:sz="1"/>
             </w:tcBorders>
-            <w:shd w:fill="FFFFFF" w:val="clear"/>
-            <w:tcMar>
-              <w:top w:type="dxa" w:w="60"/>
-              <w:left w:type="dxa" w:w="110"/>
-              <w:bottom w:type="dxa" w:w="60"/>
-              <w:right w:type="dxa" w:w="110"/>
-            </w:tcMar>
-          </w:tcPr>
-          <w:p>
-            <w:pPr>
-              <w:spacing w:after="0" w:line="252"/>
-            </w:pPr>
-            <w:r>
-              <w:t xml:space="preserve">last day of month, UTC</w:t>
+            <w:shd w:fill="F2F6FA" w:val="clear"/>
+            <w:tcMar>
+              <w:top w:type="dxa" w:w="60"/>
+              <w:left w:type="dxa" w:w="110"/>
+              <w:bottom w:type="dxa" w:w="60"/>
+              <w:right w:type="dxa" w:w="110"/>
+            </w:tcMar>
+          </w:tcPr>
+          <w:p>
+            <w:pPr>
+              <w:spacing w:after="0" w:line="252"/>
+            </w:pPr>
+            <w:r>
+              <w:t xml:space="preserve">first day of month, UTC</w:t>
             </w:r>
           </w:p>
         </w:tc>
@@ -5615,7 +5857,7 @@
               <w:bottom w:val="single" w:color="B0B0B0" w:sz="1"/>
               <w:right w:val="single" w:color="B0B0B0" w:sz="1"/>
             </w:tcBorders>
-            <w:shd w:fill="F2F6FA" w:val="clear"/>
+            <w:shd w:fill="FFFFFF" w:val="clear"/>
             <w:tcMar>
               <w:top w:type="dxa" w:w="60"/>
               <w:left w:type="dxa" w:w="110"/>
@@ -5633,7 +5875,7 @@
                 <w:sz w:val="20"/>
                 <w:szCs w:val="20"/>
               </w:rPr>
-              <w:t xml:space="preserve">schoolId</w:t>
+              <w:t xml:space="preserve">periodEnd</w:t>
             </w:r>
           </w:p>
         </w:tc>
@@ -5646,20 +5888,20 @@
               <w:bottom w:val="single" w:color="B0B0B0" w:sz="1"/>
               <w:right w:val="single" w:color="B0B0B0" w:sz="1"/>
             </w:tcBorders>
-            <w:shd w:fill="F2F6FA" w:val="clear"/>
-            <w:tcMar>
-              <w:top w:type="dxa" w:w="60"/>
-              <w:left w:type="dxa" w:w="110"/>
-              <w:bottom w:type="dxa" w:w="60"/>
-              <w:right w:type="dxa" w:w="110"/>
-            </w:tcMar>
-          </w:tcPr>
-          <w:p>
-            <w:pPr>
-              <w:spacing w:after="0" w:line="252"/>
-            </w:pPr>
-            <w:r>
-              <w:t xml:space="preserve">UUID</w:t>
+            <w:shd w:fill="FFFFFF" w:val="clear"/>
+            <w:tcMar>
+              <w:top w:type="dxa" w:w="60"/>
+              <w:left w:type="dxa" w:w="110"/>
+              <w:bottom w:type="dxa" w:w="60"/>
+              <w:right w:type="dxa" w:w="110"/>
+            </w:tcMar>
+          </w:tcPr>
+          <w:p>
+            <w:pPr>
+              <w:spacing w:after="0" w:line="252"/>
+            </w:pPr>
+            <w:r>
+              <w:t xml:space="preserve">date</w:t>
             </w:r>
           </w:p>
         </w:tc>
@@ -5672,20 +5914,20 @@
               <w:bottom w:val="single" w:color="B0B0B0" w:sz="1"/>
               <w:right w:val="single" w:color="B0B0B0" w:sz="1"/>
             </w:tcBorders>
-            <w:shd w:fill="F2F6FA" w:val="clear"/>
-            <w:tcMar>
-              <w:top w:type="dxa" w:w="60"/>
-              <w:left w:type="dxa" w:w="110"/>
-              <w:bottom w:type="dxa" w:w="60"/>
-              <w:right w:type="dxa" w:w="110"/>
-            </w:tcMar>
-          </w:tcPr>
-          <w:p>
-            <w:pPr>
-              <w:spacing w:after="0" w:line="252"/>
-            </w:pPr>
-            <w:r>
-              <w:t xml:space="preserve">RLS</w:t>
+            <w:shd w:fill="FFFFFF" w:val="clear"/>
+            <w:tcMar>
+              <w:top w:type="dxa" w:w="60"/>
+              <w:left w:type="dxa" w:w="110"/>
+              <w:bottom w:type="dxa" w:w="60"/>
+              <w:right w:type="dxa" w:w="110"/>
+            </w:tcMar>
+          </w:tcPr>
+          <w:p>
+            <w:pPr>
+              <w:spacing w:after="0" w:line="252"/>
+            </w:pPr>
+            <w:r>
+              <w:t xml:space="preserve">last day of month, UTC</w:t>
             </w:r>
           </w:p>
         </w:tc>
@@ -5703,7 +5945,7 @@
               <w:bottom w:val="single" w:color="B0B0B0" w:sz="1"/>
               <w:right w:val="single" w:color="B0B0B0" w:sz="1"/>
             </w:tcBorders>
-            <w:shd w:fill="FFFFFF" w:val="clear"/>
+            <w:shd w:fill="F2F6FA" w:val="clear"/>
             <w:tcMar>
               <w:top w:type="dxa" w:w="60"/>
               <w:left w:type="dxa" w:w="110"/>
@@ -5721,7 +5963,7 @@
                 <w:sz w:val="20"/>
                 <w:szCs w:val="20"/>
               </w:rPr>
-              <w:t xml:space="preserve">impersonatorId</w:t>
+              <w:t xml:space="preserve">schoolCode</w:t>
             </w:r>
           </w:p>
         </w:tc>
@@ -5734,6 +5976,151 @@
               <w:bottom w:val="single" w:color="B0B0B0" w:sz="1"/>
               <w:right w:val="single" w:color="B0B0B0" w:sz="1"/>
             </w:tcBorders>
+            <w:shd w:fill="F2F6FA" w:val="clear"/>
+            <w:tcMar>
+              <w:top w:type="dxa" w:w="60"/>
+              <w:left w:type="dxa" w:w="110"/>
+              <w:bottom w:type="dxa" w:w="60"/>
+              <w:right w:type="dxa" w:w="110"/>
+            </w:tcMar>
+          </w:tcPr>
+          <w:p>
+            <w:pPr>
+              <w:spacing w:after="0" w:line="252"/>
+            </w:pPr>
+            <w:r>
+              <w:t xml:space="preserve">string</w:t>
+            </w:r>
+          </w:p>
+        </w:tc>
+        <w:tc>
+          <w:tcPr>
+            <w:tcW w:type="dxa" w:w="5360"/>
+            <w:tcBorders>
+              <w:top w:val="single" w:color="B0B0B0" w:sz="1"/>
+              <w:left w:val="single" w:color="B0B0B0" w:sz="1"/>
+              <w:bottom w:val="single" w:color="B0B0B0" w:sz="1"/>
+              <w:right w:val="single" w:color="B0B0B0" w:sz="1"/>
+            </w:tcBorders>
+            <w:shd w:fill="F2F6FA" w:val="clear"/>
+            <w:tcMar>
+              <w:top w:type="dxa" w:w="60"/>
+              <w:left w:type="dxa" w:w="110"/>
+              <w:bottom w:type="dxa" w:w="60"/>
+              <w:right w:type="dxa" w:w="110"/>
+            </w:tcMar>
+          </w:tcPr>
+          <w:p>
+            <w:pPr>
+              <w:spacing w:after="0" w:line="252"/>
+            </w:pPr>
+            <w:r>
+              <w:t xml:space="preserve">RLS</w:t>
+            </w:r>
+          </w:p>
+        </w:tc>
+      </w:tr>
+      <w:tr>
+        <w:trPr>
+          <w:tblHeader w:val="false"/>
+        </w:trPr>
+        <w:tc>
+          <w:tcPr>
+            <w:tcW w:type="dxa" w:w="2200"/>
+            <w:tcBorders>
+              <w:top w:val="single" w:color="B0B0B0" w:sz="1"/>
+              <w:left w:val="single" w:color="B0B0B0" w:sz="1"/>
+              <w:bottom w:val="single" w:color="B0B0B0" w:sz="1"/>
+              <w:right w:val="single" w:color="B0B0B0" w:sz="1"/>
+            </w:tcBorders>
+            <w:shd w:fill="F2F6FA" w:val="clear"/>
+            <w:tcMar>
+              <w:top w:type="dxa" w:w="60"/>
+              <w:left w:type="dxa" w:w="110"/>
+              <w:bottom w:type="dxa" w:w="60"/>
+              <w:right w:type="dxa" w:w="110"/>
+            </w:tcMar>
+          </w:tcPr>
+          <w:p>
+            <w:pPr>
+              <w:spacing w:after="0" w:line="252"/>
+            </w:pPr>
+            <w:r>
+              <w:rPr>
+                <w:rFonts w:ascii="Consolas" w:cs="Consolas" w:eastAsia="Consolas" w:hAnsi="Consolas"/>
+                <w:sz w:val="20"/>
+                <w:szCs w:val="20"/>
+              </w:rPr>
+              <w:t xml:space="preserve">organizationCode</w:t>
+            </w:r>
+          </w:p>
+        </w:tc>
+        <w:tc>
+          <w:tcPr>
+            <w:tcW w:type="dxa" w:w="1800"/>
+            <w:tcBorders>
+              <w:top w:val="single" w:color="B0B0B0" w:sz="1"/>
+              <w:left w:val="single" w:color="B0B0B0" w:sz="1"/>
+              <w:bottom w:val="single" w:color="B0B0B0" w:sz="1"/>
+              <w:right w:val="single" w:color="B0B0B0" w:sz="1"/>
+            </w:tcBorders>
+            <w:shd w:fill="F2F6FA" w:val="clear"/>
+            <w:tcMar>
+              <w:top w:type="dxa" w:w="60"/>
+              <w:left w:type="dxa" w:w="110"/>
+              <w:bottom w:type="dxa" w:w="60"/>
+              <w:right w:type="dxa" w:w="110"/>
+            </w:tcMar>
+          </w:tcPr>
+          <w:p>
+            <w:pPr>
+              <w:spacing w:after="0" w:line="252"/>
+            </w:pPr>
+            <w:r>
+              <w:t xml:space="preserve">string</w:t>
+            </w:r>
+          </w:p>
+        </w:tc>
+        <w:tc>
+          <w:tcPr>
+            <w:tcW w:type="dxa" w:w="5360"/>
+            <w:tcBorders>
+              <w:top w:val="single" w:color="B0B0B0" w:sz="1"/>
+              <w:left w:val="single" w:color="B0B0B0" w:sz="1"/>
+              <w:bottom w:val="single" w:color="B0B0B0" w:sz="1"/>
+              <w:right w:val="single" w:color="B0B0B0" w:sz="1"/>
+            </w:tcBorders>
+            <w:shd w:fill="F2F6FA" w:val="clear"/>
+            <w:tcMar>
+              <w:top w:type="dxa" w:w="60"/>
+              <w:left w:type="dxa" w:w="110"/>
+              <w:bottom w:type="dxa" w:w="60"/>
+              <w:right w:type="dxa" w:w="110"/>
+            </w:tcMar>
+          </w:tcPr>
+          <w:p>
+            <w:pPr>
+              <w:spacing w:after="0" w:line="252"/>
+            </w:pPr>
+            <w:r>
+              <w:t xml:space="preserve">RLS scope (organization that owns the school)</w:t>
+            </w:r>
+          </w:p>
+        </w:tc>
+      </w:tr>
+      <w:tr>
+        <w:trPr>
+          <w:tblHeader w:val="false"/>
+        </w:trPr>
+        <w:tc>
+          <w:tcPr>
+            <w:tcW w:type="dxa" w:w="2200"/>
+            <w:tcBorders>
+              <w:top w:val="single" w:color="B0B0B0" w:sz="1"/>
+              <w:left w:val="single" w:color="B0B0B0" w:sz="1"/>
+              <w:bottom w:val="single" w:color="B0B0B0" w:sz="1"/>
+              <w:right w:val="single" w:color="B0B0B0" w:sz="1"/>
+            </w:tcBorders>
             <w:shd w:fill="FFFFFF" w:val="clear"/>
             <w:tcMar>
               <w:top w:type="dxa" w:w="60"/>
@@ -5747,7 +6134,38 @@
               <w:spacing w:after="0" w:line="252"/>
             </w:pPr>
             <w:r>
-              <w:t xml:space="preserve">UUID?</w:t>
+              <w:rPr>
+                <w:rFonts w:ascii="Consolas" w:cs="Consolas" w:eastAsia="Consolas" w:hAnsi="Consolas"/>
+                <w:sz w:val="20"/>
+                <w:szCs w:val="20"/>
+              </w:rPr>
+              <w:t xml:space="preserve">impersonatorCode</w:t>
+            </w:r>
+          </w:p>
+        </w:tc>
+        <w:tc>
+          <w:tcPr>
+            <w:tcW w:type="dxa" w:w="1800"/>
+            <w:tcBorders>
+              <w:top w:val="single" w:color="B0B0B0" w:sz="1"/>
+              <w:left w:val="single" w:color="B0B0B0" w:sz="1"/>
+              <w:bottom w:val="single" w:color="B0B0B0" w:sz="1"/>
+              <w:right w:val="single" w:color="B0B0B0" w:sz="1"/>
+            </w:tcBorders>
+            <w:shd w:fill="FFFFFF" w:val="clear"/>
+            <w:tcMar>
+              <w:top w:type="dxa" w:w="60"/>
+              <w:left w:type="dxa" w:w="110"/>
+              <w:bottom w:type="dxa" w:w="60"/>
+              <w:right w:type="dxa" w:w="110"/>
+            </w:tcMar>
+          </w:tcPr>
+          <w:p>
+            <w:pPr>
+              <w:spacing w:after="0" w:line="252"/>
+            </w:pPr>
+            <w:r>
+              <w:t xml:space="preserve">string?</w:t>
             </w:r>
           </w:p>
         </w:tc>
@@ -5803,7 +6221,7 @@
           <w:b/>
           <w:bCs/>
         </w:rPr>
-        <w:t xml:space="preserve">`(studentId, milestoneId, periodStart)`</w:t>
+        <w:t xml:space="preserve">`(studentCode, milestoneId, periodStart)`</w:t>
       </w:r>
       <w:r>
         <w:t xml:space="preserve">. Re-scoring the same milestone in the same period </w:t>
@@ -5842,7 +6260,7 @@
         <w:t xml:space="preserve">snapshots</w:t>
       </w:r>
       <w:r>
-        <w:t xml:space="preserve"> the client renders; the Assessments service stores only the id. Field names below align to the PRD canonical model — note the rename from the current client code (</w:t>
+        <w:t xml:space="preserve"> the client renders; the Assessments service stores only the code. Field names below reflect that cross-service references use codes, reversing the earlier (</w:t>
       </w:r>
       <w:r>
         <w:rPr>
@@ -5850,7 +6268,7 @@
           <w:sz w:val="20"/>
           <w:szCs w:val="20"/>
         </w:rPr>
-        <w:t xml:space="preserve">code</w:t>
+        <w:t xml:space="preserve">id</w:t>
       </w:r>
       <w:r>
         <w:t xml:space="preserve">→</w:t>
@@ -5861,7 +6279,7 @@
           <w:sz w:val="20"/>
           <w:szCs w:val="20"/>
         </w:rPr>
-        <w:t xml:space="preserve">id</w:t>
+        <w:t xml:space="preserve">code</w:t>
       </w:r>
       <w:r>
         <w:t xml:space="preserve">, </w:t>
@@ -5872,7 +6290,7 @@
           <w:sz w:val="20"/>
           <w:szCs w:val="20"/>
         </w:rPr>
-        <w:t xml:space="preserve">classroomCode</w:t>
+        <w:t xml:space="preserve">classroomId</w:t>
       </w:r>
       <w:r>
         <w:t xml:space="preserve">→</w:t>
@@ -5883,7 +6301,7 @@
           <w:sz w:val="20"/>
           <w:szCs w:val="20"/>
         </w:rPr>
-        <w:t xml:space="preserve">classroomId</w:t>
+        <w:t xml:space="preserve">classroomCode</w:t>
       </w:r>
       <w:r>
         <w:t xml:space="preserve">).</w:t>
@@ -5907,10 +6325,10 @@
           <w:sz w:val="20"/>
           <w:szCs w:val="20"/>
         </w:rPr>
-        <w:t xml:space="preserve">id</w:t>
-      </w:r>
-      <w:r>
-        <w:t xml:space="preserve"> (UUID), </w:t>
+        <w:t xml:space="preserve">code</w:t>
+      </w:r>
+      <w:r>
+        <w:t xml:space="preserve"> (string), </w:t>
       </w:r>
       <w:r>
         <w:rPr>
@@ -5940,45 +6358,45 @@
           <w:sz w:val="20"/>
           <w:szCs w:val="20"/>
         </w:rPr>
-        <w:t xml:space="preserve">schoolId</w:t>
-      </w:r>
-      <w:r>
-        <w:t xml:space="preserve">.</w:t>
-      </w:r>
-    </w:p>
-    <w:p>
-      <w:pPr>
-        <w:pStyle w:val="Heading2"/>
-      </w:pPr>
-      <w:r>
-        <w:t xml:space="preserve">3.2 Student (from Student Management)</w:t>
-      </w:r>
-    </w:p>
-    <w:p>
-      <w:pPr>
-        <w:spacing w:after="120" w:line="276"/>
-      </w:pPr>
+        <w:t xml:space="preserve">schoolCode</w:t>
+      </w:r>
+      <w:r>
+        <w:t xml:space="preserve">, </w:t>
+      </w:r>
       <w:r>
         <w:rPr>
           <w:rFonts w:ascii="Consolas" w:cs="Consolas" w:eastAsia="Consolas" w:hAnsi="Consolas"/>
           <w:sz w:val="20"/>
           <w:szCs w:val="20"/>
         </w:rPr>
-        <w:t xml:space="preserve">id</w:t>
-      </w:r>
-      <w:r>
-        <w:t xml:space="preserve"> (UUID), </w:t>
-      </w:r>
+        <w:t xml:space="preserve">organizationCode</w:t>
+      </w:r>
+      <w:r>
+        <w:t xml:space="preserve">.</w:t>
+      </w:r>
+    </w:p>
+    <w:p>
+      <w:pPr>
+        <w:pStyle w:val="Heading2"/>
+      </w:pPr>
+      <w:r>
+        <w:t xml:space="preserve">3.2 Student (from Student Management)</w:t>
+      </w:r>
+    </w:p>
+    <w:p>
+      <w:pPr>
+        <w:spacing w:after="120" w:line="276"/>
+      </w:pPr>
       <w:r>
         <w:rPr>
           <w:rFonts w:ascii="Consolas" w:cs="Consolas" w:eastAsia="Consolas" w:hAnsi="Consolas"/>
           <w:sz w:val="20"/>
           <w:szCs w:val="20"/>
         </w:rPr>
-        <w:t xml:space="preserve">name</w:t>
-      </w:r>
-      <w:r>
-        <w:t xml:space="preserve">, </w:t>
+        <w:t xml:space="preserve">code</w:t>
+      </w:r>
+      <w:r>
+        <w:t xml:space="preserve"> (string), </w:t>
       </w:r>
       <w:r>
         <w:rPr>
@@ -5986,10 +6404,10 @@
           <w:sz w:val="20"/>
           <w:szCs w:val="20"/>
         </w:rPr>
-        <w:t xml:space="preserve">classroomId</w:t>
-      </w:r>
-      <w:r>
-        <w:t xml:space="preserve"> (FK Classroom), </w:t>
+        <w:t xml:space="preserve">name</w:t>
+      </w:r>
+      <w:r>
+        <w:t xml:space="preserve">, </w:t>
       </w:r>
       <w:r>
         <w:rPr>
@@ -5997,10 +6415,10 @@
           <w:sz w:val="20"/>
           <w:szCs w:val="20"/>
         </w:rPr>
-        <w:t xml:space="preserve">avatar</w:t>
-      </w:r>
-      <w:r>
-        <w:t xml:space="preserve"> (URL?), </w:t>
+        <w:t xml:space="preserve">classroomCode</w:t>
+      </w:r>
+      <w:r>
+        <w:t xml:space="preserve"> (FK Classroom), </w:t>
       </w:r>
       <w:r>
         <w:rPr>
@@ -6008,10 +6426,10 @@
           <w:sz w:val="20"/>
           <w:szCs w:val="20"/>
         </w:rPr>
-        <w:t xml:space="preserve">status</w:t>
-      </w:r>
-      <w:r>
-        <w:t xml:space="preserve"> (</w:t>
+        <w:t xml:space="preserve">avatar</w:t>
+      </w:r>
+      <w:r>
+        <w:t xml:space="preserve"> (URL?), </w:t>
       </w:r>
       <w:r>
         <w:rPr>
@@ -6019,10 +6437,10 @@
           <w:sz w:val="20"/>
           <w:szCs w:val="20"/>
         </w:rPr>
-        <w:t xml:space="preserve">Active</w:t>
-      </w:r>
-      <w:r>
-        <w:t xml:space="preserve">|</w:t>
+        <w:t xml:space="preserve">isDeleted</w:t>
+      </w:r>
+      <w:r>
+        <w:t xml:space="preserve"> (boolean), </w:t>
       </w:r>
       <w:r>
         <w:rPr>
@@ -6030,10 +6448,10 @@
           <w:sz w:val="20"/>
           <w:szCs w:val="20"/>
         </w:rPr>
-        <w:t xml:space="preserve">Inactive</w:t>
-      </w:r>
-      <w:r>
-        <w:t xml:space="preserve">), </w:t>
+        <w:t xml:space="preserve">schoolCode</w:t>
+      </w:r>
+      <w:r>
+        <w:t xml:space="preserve">, </w:t>
       </w:r>
       <w:r>
         <w:rPr>
@@ -6041,7 +6459,7 @@
           <w:sz w:val="20"/>
           <w:szCs w:val="20"/>
         </w:rPr>
-        <w:t xml:space="preserve">schoolId</w:t>
+        <w:t xml:space="preserve">organizationCode</w:t>
       </w:r>
       <w:r>
         <w:t xml:space="preserve">.</w:t>
@@ -6124,7 +6542,7 @@
                 <w:sz w:val="18"/>
                 <w:szCs w:val="18"/>
               </w:rPr>
-              <w:t xml:space="preserve">  └── Domain (owned)            status, assignedClassrooms[]</w:t>
+              <w:t xml:space="preserve">  └── Domain (owned)            isDeleted, assignedClassrooms[]</w:t>
             </w:r>
           </w:p>
           <w:p>
@@ -6215,20 +6633,20 @@
                 <w:sz w:val="18"/>
                 <w:szCs w:val="18"/>
               </w:rPr>
-              <w:t xml:space="preserve">                            (studentId, milestoneId, periodStart) UNIQUE</w:t>
-            </w:r>
-          </w:p>
-          <w:p>
-            <w:pPr>
-              <w:spacing w:after="0" w:line="240"/>
-            </w:pPr>
-            <w:r>
-              <w:rPr>
-                <w:rFonts w:ascii="Consolas" w:cs="Consolas" w:eastAsia="Consolas" w:hAnsi="Consolas"/>
-                <w:sz w:val="18"/>
-                <w:szCs w:val="18"/>
-              </w:rPr>
-              <w:t xml:space="preserve">                             score 1–5, periodStart/End, assessedBy, impersonatorId</w:t>
+              <w:t xml:space="preserve">                            (studentCode, milestoneId, periodStart) UNIQUE</w:t>
+            </w:r>
+          </w:p>
+          <w:p>
+            <w:pPr>
+              <w:spacing w:after="0" w:line="240"/>
+            </w:pPr>
+            <w:r>
+              <w:rPr>
+                <w:rFonts w:ascii="Consolas" w:cs="Consolas" w:eastAsia="Consolas" w:hAnsi="Consolas"/>
+                <w:sz w:val="18"/>
+                <w:szCs w:val="18"/>
+              </w:rPr>
+              <w:t xml:space="preserve">                             score 1–5, periodStart/End, assessedBy, impersonatorCode</w:t>
             </w:r>
           </w:p>
         </w:tc>
@@ -6342,7 +6760,7 @@
         <w:spacing w:after="120" w:line="276"/>
       </w:pPr>
       <w:r>
-        <w:t xml:space="preserve">The client keeps </w:t>
+        <w:t xml:space="preserve">The client and wire both use </w:t>
       </w:r>
       <w:r>
         <w:rPr>
@@ -6350,10 +6768,10 @@
           <w:sz w:val="20"/>
           <w:szCs w:val="20"/>
         </w:rPr>
-        <w:t xml:space="preserve">bool active</w:t>
-      </w:r>
-      <w:r>
-        <w:t xml:space="preserve">; the wire uses </w:t>
+        <w:t xml:space="preserve">bool isDeleted</w:t>
+      </w:r>
+      <w:r>
+        <w:t xml:space="preserve">. The legacy </w:t>
       </w:r>
       <w:r>
         <w:rPr>
@@ -6361,10 +6779,10 @@
           <w:sz w:val="20"/>
           <w:szCs w:val="20"/>
         </w:rPr>
-        <w:t xml:space="preserve">status</w:t>
-      </w:r>
-      <w:r>
-        <w:t xml:space="preserve">. Mapping happens only in the DTO:</w:t>
+        <w:t xml:space="preserve">status active|inactive</w:t>
+      </w:r>
+      <w:r>
+        <w:t xml:space="preserve"> string is dropped; mapping in the DTO:</w:t>
       </w:r>
     </w:p>
     <w:p>
@@ -6393,7 +6811,7 @@
           <w:sz w:val="20"/>
           <w:szCs w:val="20"/>
         </w:rPr>
-        <w:t xml:space="preserve">active = (json['status'] != 'inactive')</w:t>
+        <w:t xml:space="preserve">isDeleted = json['isDeleted'] ?? false</w:t>
       </w:r>
     </w:p>
     <w:p>
@@ -6422,10 +6840,10 @@
           <w:sz w:val="20"/>
           <w:szCs w:val="20"/>
         </w:rPr>
-        <w:t xml:space="preserve">'status': active ? 'active' : 'inactive'</w:t>
-      </w:r>
-      <w:r>
-        <w:t xml:space="preserve"> (only where a write needs it; most writes don't send status — deactivation is a </w:t>
+        <w:t xml:space="preserve">'isDeleted': isDeleted</w:t>
+      </w:r>
+      <w:r>
+        <w:t xml:space="preserve"> (only where a write needs it; most writes don't send isDeleted — deactivation is a </w:t>
       </w:r>
       <w:r>
         <w:rPr>
@@ -6456,7 +6874,7 @@
         <w:t xml:space="preserve">Write bodies are narrow</w:t>
       </w:r>
       <w:r>
-        <w:t xml:space="preserve"> (server manages ids, status, audit fields, and nesting):</w:t>
+        <w:t xml:space="preserve"> (server manages ids, isDeleted, audit fields, and nesting):</w:t>
       </w:r>
     </w:p>
     <w:p>
@@ -6568,7 +6986,7 @@
           <w:sz w:val="20"/>
           <w:szCs w:val="20"/>
         </w:rPr>
-        <w:t xml:space="preserve">{ classroomIds: [...] }</w:t>
+        <w:t xml:space="preserve">{ classroomCodes: [...] }</w:t>
       </w:r>
     </w:p>
     <w:p>
@@ -6715,20 +7133,20 @@
                 <w:sz w:val="18"/>
                 <w:szCs w:val="18"/>
               </w:rPr>
-              <w:t xml:space="preserve">    { "studentId": "...", "milestoneId": "...", "subdomainId": "...",</w:t>
-            </w:r>
-          </w:p>
-          <w:p>
-            <w:pPr>
-              <w:spacing w:after="0" w:line="240"/>
-            </w:pPr>
-            <w:r>
-              <w:rPr>
-                <w:rFonts w:ascii="Consolas" w:cs="Consolas" w:eastAsia="Consolas" w:hAnsi="Consolas"/>
-                <w:sz w:val="18"/>
-                <w:szCs w:val="18"/>
-              </w:rPr>
-              <w:t xml:space="preserve">      "domainId": "...", "score": 4, "notes": "optional" }</w:t>
+              <w:t xml:space="preserve">    { "studentCode": "...", "milestoneId": "...", "subdomainId": "...",</w:t>
+            </w:r>
+          </w:p>
+          <w:p>
+            <w:pPr>
+              <w:spacing w:after="0" w:line="240"/>
+            </w:pPr>
+            <w:r>
+              <w:rPr>
+                <w:rFonts w:ascii="Consolas" w:cs="Consolas" w:eastAsia="Consolas" w:hAnsi="Consolas"/>
+                <w:sz w:val="18"/>
+                <w:szCs w:val="18"/>
+              </w:rPr>
+              <w:t xml:space="preserve">      "domainId": "...", "score": 4, "notes": "optional", "isPublished": true }</w:t>
             </w:r>
           </w:p>
           <w:p>
@@ -6797,7 +7215,7 @@
           <w:sz w:val="20"/>
           <w:szCs w:val="20"/>
         </w:rPr>
-        <w:t xml:space="preserve">schoolId</w:t>
+        <w:t xml:space="preserve">schoolCode, organizationCode</w:t>
       </w:r>
       <w:r>
         <w:t xml:space="preserve">, </w:t>
@@ -6808,7 +7226,7 @@
           <w:sz w:val="20"/>
           <w:szCs w:val="20"/>
         </w:rPr>
-        <w:t xml:space="preserve">impersonatorId</w:t>
+        <w:t xml:space="preserve">impersonatorCode</w:t>
       </w:r>
       <w:r>
         <w:t xml:space="preserve"> are </w:t>
@@ -6855,7 +7273,7 @@
           <w:sz w:val="20"/>
           <w:szCs w:val="20"/>
         </w:rPr>
-        <w:t xml:space="preserve">/api/schools/{schoolId}/…</w:t>
+        <w:t xml:space="preserve">/api/schools/{schoolCode}/…</w:t>
       </w:r>
       <w:r>
         <w:t xml:space="preserve">, JWT-authenticated, RLS-scoped.</w:t>
@@ -6891,7 +7309,7 @@
         <w:t xml:space="preserve">GET /domains</w:t>
       </w:r>
       <w:r>
-        <w:t xml:space="preserve"> → nested tree (active by default)</w:t>
+        <w:t xml:space="preserve"> → nested tree (non-deleted by default)</w:t>
       </w:r>
     </w:p>
     <w:p>
@@ -7059,7 +7477,7 @@
           <w:sz w:val="20"/>
           <w:szCs w:val="20"/>
         </w:rPr>
-        <w:t xml:space="preserve">GET /assessments?classroomId=&amp;periodStart=&amp;periodEnd=</w:t>
+        <w:t xml:space="preserve">GET /assessments?classroomCode=&amp;periodStart=&amp;periodEnd=</w:t>
       </w:r>
       <w:r>
         <w:t xml:space="preserve"> — scoped list (never “all”)</w:t>
@@ -7080,7 +7498,7 @@
           <w:sz w:val="20"/>
           <w:szCs w:val="20"/>
         </w:rPr>
-        <w:t xml:space="preserve">GET /assessments/student/{studentId}?periodStart=&amp;periodEnd=</w:t>
+        <w:t xml:space="preserve">GET /assessments/student/{studentCode}?periodStart=&amp;periodEnd=</w:t>
       </w:r>
     </w:p>
     <w:p>
@@ -7131,7 +7549,7 @@
           <w:sz w:val="20"/>
           <w:szCs w:val="20"/>
         </w:rPr>
-        <w:t xml:space="preserve">GET /assessments/classroom/{classroomId}?periodStart=&amp;periodEnd=</w:t>
+        <w:t xml:space="preserve">GET /assessments/classroom/{classroomCode}?periodStart=&amp;periodEnd=</w:t>
       </w:r>
     </w:p>
     <w:p>
@@ -7621,7 +8039,7 @@
                 <w:sz w:val="20"/>
                 <w:szCs w:val="20"/>
               </w:rPr>
-              <w:t xml:space="preserve">X-School-Id</w:t>
+              <w:t xml:space="preserve">X-School-Code</w:t>
             </w:r>
           </w:p>
         </w:tc>
@@ -8005,7 +8423,7 @@
           <w:sz w:val="20"/>
           <w:szCs w:val="20"/>
         </w:rPr>
-        <w:t xml:space="preserve">schoolId</w:t>
+        <w:t xml:space="preserve">schoolCode</w:t>
       </w:r>
       <w:r>
         <w:t xml:space="preserve"> / </w:t>
@@ -8016,7 +8434,7 @@
           <w:sz w:val="20"/>
           <w:szCs w:val="20"/>
         </w:rPr>
-        <w:t xml:space="preserve">schoolCode</w:t>
+        <w:t xml:space="preserve">organizationCode</w:t>
       </w:r>
       <w:r>
         <w:t xml:space="preserve">, </w:t>
@@ -8041,7 +8459,7 @@
         <w:t xml:space="preserve">activeSchoolRole</w:t>
       </w:r>
       <w:r>
-        <w:t xml:space="preserve">, staff allowed-classroom ids — already present, drive </w:t>
+        <w:t xml:space="preserve">, staff allowed-classroom codes — already present, drive </w:t>
       </w:r>
       <w:r>
         <w:rPr>
@@ -8049,7 +8467,7 @@
           <w:sz w:val="20"/>
           <w:szCs w:val="20"/>
         </w:rPr>
-        <w:t xml:space="preserve">X-School-Id</w:t>
+        <w:t xml:space="preserve">X-School-Code</w:t>
       </w:r>
       <w:r>
         <w:t xml:space="preserve"> + scoping</w:t>
@@ -8653,7 +9071,7 @@
               <w:spacing w:after="0" w:line="252"/>
             </w:pPr>
             <w:r>
-              <w:t xml:space="preserve">“Cannot score an inactive milestone” — defensive server check</w:t>
+              <w:t xml:space="preserve">“Cannot score a deleted milestone” — defensive server check</w:t>
             </w:r>
           </w:p>
         </w:tc>
@@ -8817,7 +9235,7 @@
           <w:sz w:val="20"/>
           <w:szCs w:val="20"/>
         </w:rPr>
-        <w:t xml:space="preserve">bool active</w:t>
+        <w:t xml:space="preserve">bool isDeleted</w:t>
       </w:r>
       <w:r>
         <w:t xml:space="preserve">, </w:t>
@@ -8903,7 +9321,7 @@
           <w:sz w:val="20"/>
           <w:szCs w:val="20"/>
         </w:rPr>
-        <w:t xml:space="preserve">code→id</w:t>
+        <w:t xml:space="preserve">id→code</w:t>
       </w:r>
       <w:r>
         <w:t xml:space="preserve"> / </w:t>
@@ -8914,7 +9332,7 @@
           <w:sz w:val="20"/>
           <w:szCs w:val="20"/>
         </w:rPr>
-        <w:t xml:space="preserve">classroomCode→classroomId</w:t>
+        <w:t xml:space="preserve">classroomId→classroomCode</w:t>
       </w:r>
       <w:r>
         <w:t xml:space="preserve">, </w:t>
@@ -8935,10 +9353,10 @@
           <w:b/>
           <w:bCs/>
         </w:rPr>
-        <w:t xml:space="preserve">ids</w:t>
-      </w:r>
-      <w:r>
-        <w:t xml:space="preserve">.</w:t>
+        <w:t xml:space="preserve">codes</w:t>
+      </w:r>
+      <w:r>
+        <w:t xml:space="preserve">; soft-delete is now a bool isDeleted (replaces the old status active|inactive); every entity carries schoolCode + organizationCode; Assessment gains an isPublished flag.</w:t>
       </w:r>
     </w:p>
     <w:p>
@@ -9163,6 +9581,2024 @@
         <w:t xml:space="preserve">Once the contract is agreed, the data-layer implementation (remote datasource, DTOs, repository rewrite) and the downstream ripple (§11) become a separate, scoped engineering task.</w:t>
       </w:r>
     </w:p>
+    <w:p>
+      <w:pPr>
+        <w:pStyle w:val="Heading1"/>
+      </w:pPr>
+      <w:r>
+        <w:t xml:space="preserve">12. Mock data responses</w:t>
+      </w:r>
+    </w:p>
+    <w:p>
+      <w:pPr>
+        <w:spacing w:after="120" w:line="276"/>
+      </w:pPr>
+      <w:r>
+        <w:t xml:space="preserve">Illustrative JSON payloads for the model above, reflecting the final field set: every entity carries </w:t>
+      </w:r>
+      <w:r>
+        <w:rPr>
+          <w:rFonts w:ascii="Consolas" w:cs="Consolas" w:eastAsia="Consolas" w:hAnsi="Consolas"/>
+          <w:sz w:val="20"/>
+          <w:szCs w:val="20"/>
+        </w:rPr>
+        <w:t xml:space="preserve">schoolCode</w:t>
+      </w:r>
+      <w:r>
+        <w:t xml:space="preserve"> and </w:t>
+      </w:r>
+      <w:r>
+        <w:rPr>
+          <w:rFonts w:ascii="Consolas" w:cs="Consolas" w:eastAsia="Consolas" w:hAnsi="Consolas"/>
+          <w:sz w:val="20"/>
+          <w:szCs w:val="20"/>
+        </w:rPr>
+        <w:t xml:space="preserve">organizationCode</w:t>
+      </w:r>
+      <w:r>
+        <w:t xml:space="preserve">; soft-delete is an </w:t>
+      </w:r>
+      <w:r>
+        <w:rPr>
+          <w:rFonts w:ascii="Consolas" w:cs="Consolas" w:eastAsia="Consolas" w:hAnsi="Consolas"/>
+          <w:sz w:val="20"/>
+          <w:szCs w:val="20"/>
+        </w:rPr>
+        <w:t xml:space="preserve">isDeleted</w:t>
+      </w:r>
+      <w:r>
+        <w:t xml:space="preserve"> boolean; cross-service references are </w:t>
+      </w:r>
+      <w:r>
+        <w:rPr>
+          <w:rFonts w:ascii="Consolas" w:cs="Consolas" w:eastAsia="Consolas" w:hAnsi="Consolas"/>
+          <w:sz w:val="20"/>
+          <w:szCs w:val="20"/>
+        </w:rPr>
+        <w:t xml:space="preserve">codes</w:t>
+      </w:r>
+      <w:r>
+        <w:t xml:space="preserve"> (student, classroom, school, organization, user) while same-service foreign keys stay UUID </w:t>
+      </w:r>
+      <w:r>
+        <w:rPr>
+          <w:rFonts w:ascii="Consolas" w:cs="Consolas" w:eastAsia="Consolas" w:hAnsi="Consolas"/>
+          <w:sz w:val="20"/>
+          <w:szCs w:val="20"/>
+        </w:rPr>
+        <w:t xml:space="preserve">ids</w:t>
+      </w:r>
+      <w:r>
+        <w:t xml:space="preserve">; and </w:t>
+      </w:r>
+      <w:r>
+        <w:rPr>
+          <w:rFonts w:ascii="Consolas" w:cs="Consolas" w:eastAsia="Consolas" w:hAnsi="Consolas"/>
+          <w:sz w:val="20"/>
+          <w:szCs w:val="20"/>
+        </w:rPr>
+        <w:t xml:space="preserve">Assessment</w:t>
+      </w:r>
+      <w:r>
+        <w:t xml:space="preserve"> carries an </w:t>
+      </w:r>
+      <w:r>
+        <w:rPr>
+          <w:rFonts w:ascii="Consolas" w:cs="Consolas" w:eastAsia="Consolas" w:hAnsi="Consolas"/>
+          <w:sz w:val="20"/>
+          <w:szCs w:val="20"/>
+        </w:rPr>
+        <w:t xml:space="preserve">isPublished</w:t>
+      </w:r>
+      <w:r>
+        <w:t xml:space="preserve"> flag. Server-derived and audit fields are shown as they appear on read responses.</w:t>
+      </w:r>
+    </w:p>
+    <w:p>
+      <w:pPr>
+        <w:spacing w:after="60"/>
+      </w:pPr>
+      <w:r>
+        <w:rPr>
+          <w:b/>
+          <w:bCs/>
+        </w:rPr>
+        <w:t xml:space="preserve">GET /api/schools/{schoolCode}/domains — nested framework tree</w:t>
+      </w:r>
+    </w:p>
+    <w:tbl>
+      <w:tblPr>
+        <w:tblW w:type="dxa" w:w="9360"/>
+        <w:tblBorders>
+          <w:top w:val="single" w:color="D0D7DE" w:sz="4"/>
+          <w:left w:val="single" w:color="D0D7DE" w:sz="4"/>
+          <w:bottom w:val="single" w:color="D0D7DE" w:sz="4"/>
+          <w:right w:val="single" w:color="D0D7DE" w:sz="4"/>
+          <w:insideH w:val="none"/>
+          <w:insideV w:val="none"/>
+        </w:tblBorders>
+      </w:tblPr>
+      <w:tblGrid>
+        <w:gridCol w:w="9360"/>
+      </w:tblGrid>
+      <w:tr>
+        <w:tc>
+          <w:tcPr>
+            <w:tcW w:type="dxa" w:w="9360"/>
+            <w:shd w:fill="F6F8FA" w:val="clear"/>
+            <w:tcMar>
+              <w:top w:type="dxa" w:w="120"/>
+              <w:left w:type="dxa" w:w="160"/>
+              <w:bottom w:type="dxa" w:w="120"/>
+              <w:right w:type="dxa" w:w="160"/>
+            </w:tcMar>
+          </w:tcPr>
+          <w:p>
+            <w:pPr>
+              <w:spacing w:after="0" w:line="240"/>
+            </w:pPr>
+            <w:r>
+              <w:rPr>
+                <w:rFonts w:ascii="Consolas" w:cs="Consolas" w:eastAsia="Consolas" w:hAnsi="Consolas"/>
+                <w:sz w:val="18"/>
+                <w:szCs w:val="18"/>
+              </w:rPr>
+              <w:t xml:space="preserve">{</w:t>
+            </w:r>
+          </w:p>
+          <w:p>
+            <w:pPr>
+              <w:spacing w:after="0" w:line="240"/>
+            </w:pPr>
+            <w:r>
+              <w:rPr>
+                <w:rFonts w:ascii="Consolas" w:cs="Consolas" w:eastAsia="Consolas" w:hAnsi="Consolas"/>
+                <w:sz w:val="18"/>
+                <w:szCs w:val="18"/>
+              </w:rPr>
+              <w:t xml:space="preserve">  "domains": [</w:t>
+            </w:r>
+          </w:p>
+          <w:p>
+            <w:pPr>
+              <w:spacing w:after="0" w:line="240"/>
+            </w:pPr>
+            <w:r>
+              <w:rPr>
+                <w:rFonts w:ascii="Consolas" w:cs="Consolas" w:eastAsia="Consolas" w:hAnsi="Consolas"/>
+                <w:sz w:val="18"/>
+                <w:szCs w:val="18"/>
+              </w:rPr>
+              <w:t xml:space="preserve">    {</w:t>
+            </w:r>
+          </w:p>
+          <w:p>
+            <w:pPr>
+              <w:spacing w:after="0" w:line="240"/>
+            </w:pPr>
+            <w:r>
+              <w:rPr>
+                <w:rFonts w:ascii="Consolas" w:cs="Consolas" w:eastAsia="Consolas" w:hAnsi="Consolas"/>
+                <w:sz w:val="18"/>
+                <w:szCs w:val="18"/>
+              </w:rPr>
+              <w:t xml:space="preserve">      "id": "d1a2...-domain-uuid",</w:t>
+            </w:r>
+          </w:p>
+          <w:p>
+            <w:pPr>
+              <w:spacing w:after="0" w:line="240"/>
+            </w:pPr>
+            <w:r>
+              <w:rPr>
+                <w:rFonts w:ascii="Consolas" w:cs="Consolas" w:eastAsia="Consolas" w:hAnsi="Consolas"/>
+                <w:sz w:val="18"/>
+                <w:szCs w:val="18"/>
+              </w:rPr>
+              <w:t xml:space="preserve">      "name": "Social &amp; Emotional",</w:t>
+            </w:r>
+          </w:p>
+          <w:p>
+            <w:pPr>
+              <w:spacing w:after="0" w:line="240"/>
+            </w:pPr>
+            <w:r>
+              <w:rPr>
+                <w:rFonts w:ascii="Consolas" w:cs="Consolas" w:eastAsia="Consolas" w:hAnsi="Consolas"/>
+                <w:sz w:val="18"/>
+                <w:szCs w:val="18"/>
+              </w:rPr>
+              <w:t xml:space="preserve">      "description": "Relationships, self-regulation, empathy.",</w:t>
+            </w:r>
+          </w:p>
+          <w:p>
+            <w:pPr>
+              <w:spacing w:after="0" w:line="240"/>
+            </w:pPr>
+            <w:r>
+              <w:rPr>
+                <w:rFonts w:ascii="Consolas" w:cs="Consolas" w:eastAsia="Consolas" w:hAnsi="Consolas"/>
+                <w:sz w:val="18"/>
+                <w:szCs w:val="18"/>
+              </w:rPr>
+              <w:t xml:space="preserve">      "assignedClassrooms": ["CLS-TODDLER-A", "CLS-TODDLER-B"],</w:t>
+            </w:r>
+          </w:p>
+          <w:p>
+            <w:pPr>
+              <w:spacing w:after="0" w:line="240"/>
+            </w:pPr>
+            <w:r>
+              <w:rPr>
+                <w:rFonts w:ascii="Consolas" w:cs="Consolas" w:eastAsia="Consolas" w:hAnsi="Consolas"/>
+                <w:sz w:val="18"/>
+                <w:szCs w:val="18"/>
+              </w:rPr>
+              <w:t xml:space="preserve">      "isDeleted": false,</w:t>
+            </w:r>
+          </w:p>
+          <w:p>
+            <w:pPr>
+              <w:spacing w:after="0" w:line="240"/>
+            </w:pPr>
+            <w:r>
+              <w:rPr>
+                <w:rFonts w:ascii="Consolas" w:cs="Consolas" w:eastAsia="Consolas" w:hAnsi="Consolas"/>
+                <w:sz w:val="18"/>
+                <w:szCs w:val="18"/>
+              </w:rPr>
+              <w:t xml:space="preserve">      "schoolCode": "SCH-1042",</w:t>
+            </w:r>
+          </w:p>
+          <w:p>
+            <w:pPr>
+              <w:spacing w:after="0" w:line="240"/>
+            </w:pPr>
+            <w:r>
+              <w:rPr>
+                <w:rFonts w:ascii="Consolas" w:cs="Consolas" w:eastAsia="Consolas" w:hAnsi="Consolas"/>
+                <w:sz w:val="18"/>
+                <w:szCs w:val="18"/>
+              </w:rPr>
+              <w:t xml:space="preserve">      "organizationCode": "ORG-88",</w:t>
+            </w:r>
+          </w:p>
+          <w:p>
+            <w:pPr>
+              <w:spacing w:after="0" w:line="240"/>
+            </w:pPr>
+            <w:r>
+              <w:rPr>
+                <w:rFonts w:ascii="Consolas" w:cs="Consolas" w:eastAsia="Consolas" w:hAnsi="Consolas"/>
+                <w:sz w:val="18"/>
+                <w:szCs w:val="18"/>
+              </w:rPr>
+              <w:t xml:space="preserve">      "createdBy": "USR-admin-7",</w:t>
+            </w:r>
+          </w:p>
+          <w:p>
+            <w:pPr>
+              <w:spacing w:after="0" w:line="240"/>
+            </w:pPr>
+            <w:r>
+              <w:rPr>
+                <w:rFonts w:ascii="Consolas" w:cs="Consolas" w:eastAsia="Consolas" w:hAnsi="Consolas"/>
+                <w:sz w:val="18"/>
+                <w:szCs w:val="18"/>
+              </w:rPr>
+              <w:t xml:space="preserve">      "updatedBy": "USR-admin-7",</w:t>
+            </w:r>
+          </w:p>
+          <w:p>
+            <w:pPr>
+              <w:spacing w:after="0" w:line="240"/>
+            </w:pPr>
+            <w:r>
+              <w:rPr>
+                <w:rFonts w:ascii="Consolas" w:cs="Consolas" w:eastAsia="Consolas" w:hAnsi="Consolas"/>
+                <w:sz w:val="18"/>
+                <w:szCs w:val="18"/>
+              </w:rPr>
+              <w:t xml:space="preserve">      "createdAt": "2026-01-12T09:00:00Z",</w:t>
+            </w:r>
+          </w:p>
+          <w:p>
+            <w:pPr>
+              <w:spacing w:after="0" w:line="240"/>
+            </w:pPr>
+            <w:r>
+              <w:rPr>
+                <w:rFonts w:ascii="Consolas" w:cs="Consolas" w:eastAsia="Consolas" w:hAnsi="Consolas"/>
+                <w:sz w:val="18"/>
+                <w:szCs w:val="18"/>
+              </w:rPr>
+              <w:t xml:space="preserve">      "updatedAt": "2026-05-03T14:22:10Z",</w:t>
+            </w:r>
+          </w:p>
+          <w:p>
+            <w:pPr>
+              <w:spacing w:after="0" w:line="240"/>
+            </w:pPr>
+            <w:r>
+              <w:rPr>
+                <w:rFonts w:ascii="Consolas" w:cs="Consolas" w:eastAsia="Consolas" w:hAnsi="Consolas"/>
+                <w:sz w:val="18"/>
+                <w:szCs w:val="18"/>
+              </w:rPr>
+              <w:t xml:space="preserve">      "subdomains": [</w:t>
+            </w:r>
+          </w:p>
+          <w:p>
+            <w:pPr>
+              <w:spacing w:after="0" w:line="240"/>
+            </w:pPr>
+            <w:r>
+              <w:rPr>
+                <w:rFonts w:ascii="Consolas" w:cs="Consolas" w:eastAsia="Consolas" w:hAnsi="Consolas"/>
+                <w:sz w:val="18"/>
+                <w:szCs w:val="18"/>
+              </w:rPr>
+              <w:t xml:space="preserve">        {</w:t>
+            </w:r>
+          </w:p>
+          <w:p>
+            <w:pPr>
+              <w:spacing w:after="0" w:line="240"/>
+            </w:pPr>
+            <w:r>
+              <w:rPr>
+                <w:rFonts w:ascii="Consolas" w:cs="Consolas" w:eastAsia="Consolas" w:hAnsi="Consolas"/>
+                <w:sz w:val="18"/>
+                <w:szCs w:val="18"/>
+              </w:rPr>
+              <w:t xml:space="preserve">          "id": "s1b2...-subdomain-uuid",</w:t>
+            </w:r>
+          </w:p>
+          <w:p>
+            <w:pPr>
+              <w:spacing w:after="0" w:line="240"/>
+            </w:pPr>
+            <w:r>
+              <w:rPr>
+                <w:rFonts w:ascii="Consolas" w:cs="Consolas" w:eastAsia="Consolas" w:hAnsi="Consolas"/>
+                <w:sz w:val="18"/>
+                <w:szCs w:val="18"/>
+              </w:rPr>
+              <w:t xml:space="preserve">          "domainId": "d1a2...-domain-uuid",</w:t>
+            </w:r>
+          </w:p>
+          <w:p>
+            <w:pPr>
+              <w:spacing w:after="0" w:line="240"/>
+            </w:pPr>
+            <w:r>
+              <w:rPr>
+                <w:rFonts w:ascii="Consolas" w:cs="Consolas" w:eastAsia="Consolas" w:hAnsi="Consolas"/>
+                <w:sz w:val="18"/>
+                <w:szCs w:val="18"/>
+              </w:rPr>
+              <w:t xml:space="preserve">          "name": "Emotional Regulation",</w:t>
+            </w:r>
+          </w:p>
+          <w:p>
+            <w:pPr>
+              <w:spacing w:after="0" w:line="240"/>
+            </w:pPr>
+            <w:r>
+              <w:rPr>
+                <w:rFonts w:ascii="Consolas" w:cs="Consolas" w:eastAsia="Consolas" w:hAnsi="Consolas"/>
+                <w:sz w:val="18"/>
+                <w:szCs w:val="18"/>
+              </w:rPr>
+              <w:t xml:space="preserve">          "assignedClassrooms": ["CLS-TODDLER-A"],</w:t>
+            </w:r>
+          </w:p>
+          <w:p>
+            <w:pPr>
+              <w:spacing w:after="0" w:line="240"/>
+            </w:pPr>
+            <w:r>
+              <w:rPr>
+                <w:rFonts w:ascii="Consolas" w:cs="Consolas" w:eastAsia="Consolas" w:hAnsi="Consolas"/>
+                <w:sz w:val="18"/>
+                <w:szCs w:val="18"/>
+              </w:rPr>
+              <w:t xml:space="preserve">          "isDeleted": false,</w:t>
+            </w:r>
+          </w:p>
+          <w:p>
+            <w:pPr>
+              <w:spacing w:after="0" w:line="240"/>
+            </w:pPr>
+            <w:r>
+              <w:rPr>
+                <w:rFonts w:ascii="Consolas" w:cs="Consolas" w:eastAsia="Consolas" w:hAnsi="Consolas"/>
+                <w:sz w:val="18"/>
+                <w:szCs w:val="18"/>
+              </w:rPr>
+              <w:t xml:space="preserve">          "schoolCode": "SCH-1042",</w:t>
+            </w:r>
+          </w:p>
+          <w:p>
+            <w:pPr>
+              <w:spacing w:after="0" w:line="240"/>
+            </w:pPr>
+            <w:r>
+              <w:rPr>
+                <w:rFonts w:ascii="Consolas" w:cs="Consolas" w:eastAsia="Consolas" w:hAnsi="Consolas"/>
+                <w:sz w:val="18"/>
+                <w:szCs w:val="18"/>
+              </w:rPr>
+              <w:t xml:space="preserve">          "organizationCode": "ORG-88",</w:t>
+            </w:r>
+          </w:p>
+          <w:p>
+            <w:pPr>
+              <w:spacing w:after="0" w:line="240"/>
+            </w:pPr>
+            <w:r>
+              <w:rPr>
+                <w:rFonts w:ascii="Consolas" w:cs="Consolas" w:eastAsia="Consolas" w:hAnsi="Consolas"/>
+                <w:sz w:val="18"/>
+                <w:szCs w:val="18"/>
+              </w:rPr>
+              <w:t xml:space="preserve">          "createdBy": "USR-admin-7",</w:t>
+            </w:r>
+          </w:p>
+          <w:p>
+            <w:pPr>
+              <w:spacing w:after="0" w:line="240"/>
+            </w:pPr>
+            <w:r>
+              <w:rPr>
+                <w:rFonts w:ascii="Consolas" w:cs="Consolas" w:eastAsia="Consolas" w:hAnsi="Consolas"/>
+                <w:sz w:val="18"/>
+                <w:szCs w:val="18"/>
+              </w:rPr>
+              <w:t xml:space="preserve">          "updatedBy": "USR-admin-7",</w:t>
+            </w:r>
+          </w:p>
+          <w:p>
+            <w:pPr>
+              <w:spacing w:after="0" w:line="240"/>
+            </w:pPr>
+            <w:r>
+              <w:rPr>
+                <w:rFonts w:ascii="Consolas" w:cs="Consolas" w:eastAsia="Consolas" w:hAnsi="Consolas"/>
+                <w:sz w:val="18"/>
+                <w:szCs w:val="18"/>
+              </w:rPr>
+              <w:t xml:space="preserve">          "createdAt": "2026-01-12T09:00:00Z",</w:t>
+            </w:r>
+          </w:p>
+          <w:p>
+            <w:pPr>
+              <w:spacing w:after="0" w:line="240"/>
+            </w:pPr>
+            <w:r>
+              <w:rPr>
+                <w:rFonts w:ascii="Consolas" w:cs="Consolas" w:eastAsia="Consolas" w:hAnsi="Consolas"/>
+                <w:sz w:val="18"/>
+                <w:szCs w:val="18"/>
+              </w:rPr>
+              <w:t xml:space="preserve">          "updatedAt": "2026-01-12T09:00:00Z",</w:t>
+            </w:r>
+          </w:p>
+          <w:p>
+            <w:pPr>
+              <w:spacing w:after="0" w:line="240"/>
+            </w:pPr>
+            <w:r>
+              <w:rPr>
+                <w:rFonts w:ascii="Consolas" w:cs="Consolas" w:eastAsia="Consolas" w:hAnsi="Consolas"/>
+                <w:sz w:val="18"/>
+                <w:szCs w:val="18"/>
+              </w:rPr>
+              <w:t xml:space="preserve">          "milestones": [</w:t>
+            </w:r>
+          </w:p>
+          <w:p>
+            <w:pPr>
+              <w:spacing w:after="0" w:line="240"/>
+            </w:pPr>
+            <w:r>
+              <w:rPr>
+                <w:rFonts w:ascii="Consolas" w:cs="Consolas" w:eastAsia="Consolas" w:hAnsi="Consolas"/>
+                <w:sz w:val="18"/>
+                <w:szCs w:val="18"/>
+              </w:rPr>
+              <w:t xml:space="preserve">            {</w:t>
+            </w:r>
+          </w:p>
+          <w:p>
+            <w:pPr>
+              <w:spacing w:after="0" w:line="240"/>
+            </w:pPr>
+            <w:r>
+              <w:rPr>
+                <w:rFonts w:ascii="Consolas" w:cs="Consolas" w:eastAsia="Consolas" w:hAnsi="Consolas"/>
+                <w:sz w:val="18"/>
+                <w:szCs w:val="18"/>
+              </w:rPr>
+              <w:t xml:space="preserve">              "id": "m1c2...-milestone-uuid",</w:t>
+            </w:r>
+          </w:p>
+          <w:p>
+            <w:pPr>
+              <w:spacing w:after="0" w:line="240"/>
+            </w:pPr>
+            <w:r>
+              <w:rPr>
+                <w:rFonts w:ascii="Consolas" w:cs="Consolas" w:eastAsia="Consolas" w:hAnsi="Consolas"/>
+                <w:sz w:val="18"/>
+                <w:szCs w:val="18"/>
+              </w:rPr>
+              <w:t xml:space="preserve">              "subdomainId": "s1b2...-subdomain-uuid",</w:t>
+            </w:r>
+          </w:p>
+          <w:p>
+            <w:pPr>
+              <w:spacing w:after="0" w:line="240"/>
+            </w:pPr>
+            <w:r>
+              <w:rPr>
+                <w:rFonts w:ascii="Consolas" w:cs="Consolas" w:eastAsia="Consolas" w:hAnsi="Consolas"/>
+                <w:sz w:val="18"/>
+                <w:szCs w:val="18"/>
+              </w:rPr>
+              <w:t xml:space="preserve">              "domainId": "d1a2...-domain-uuid",</w:t>
+            </w:r>
+          </w:p>
+          <w:p>
+            <w:pPr>
+              <w:spacing w:after="0" w:line="240"/>
+            </w:pPr>
+            <w:r>
+              <w:rPr>
+                <w:rFonts w:ascii="Consolas" w:cs="Consolas" w:eastAsia="Consolas" w:hAnsi="Consolas"/>
+                <w:sz w:val="18"/>
+                <w:szCs w:val="18"/>
+              </w:rPr>
+              <w:t xml:space="preserve">              "name": "Calms with adult support",</w:t>
+            </w:r>
+          </w:p>
+          <w:p>
+            <w:pPr>
+              <w:spacing w:after="0" w:line="240"/>
+            </w:pPr>
+            <w:r>
+              <w:rPr>
+                <w:rFonts w:ascii="Consolas" w:cs="Consolas" w:eastAsia="Consolas" w:hAnsi="Consolas"/>
+                <w:sz w:val="18"/>
+                <w:szCs w:val="18"/>
+              </w:rPr>
+              <w:t xml:space="preserve">              "description": "Accepts comfort from a caregiver when upset.",</w:t>
+            </w:r>
+          </w:p>
+          <w:p>
+            <w:pPr>
+              <w:spacing w:after="0" w:line="240"/>
+            </w:pPr>
+            <w:r>
+              <w:rPr>
+                <w:rFonts w:ascii="Consolas" w:cs="Consolas" w:eastAsia="Consolas" w:hAnsi="Consolas"/>
+                <w:sz w:val="18"/>
+                <w:szCs w:val="18"/>
+              </w:rPr>
+              <w:t xml:space="preserve">              "ageGroup": "0-12m",</w:t>
+            </w:r>
+          </w:p>
+          <w:p>
+            <w:pPr>
+              <w:spacing w:after="0" w:line="240"/>
+            </w:pPr>
+            <w:r>
+              <w:rPr>
+                <w:rFonts w:ascii="Consolas" w:cs="Consolas" w:eastAsia="Consolas" w:hAnsi="Consolas"/>
+                <w:sz w:val="18"/>
+                <w:szCs w:val="18"/>
+              </w:rPr>
+              <w:t xml:space="preserve">              "assignedClassrooms": ["CLS-TODDLER-A"],</w:t>
+            </w:r>
+          </w:p>
+          <w:p>
+            <w:pPr>
+              <w:spacing w:after="0" w:line="240"/>
+            </w:pPr>
+            <w:r>
+              <w:rPr>
+                <w:rFonts w:ascii="Consolas" w:cs="Consolas" w:eastAsia="Consolas" w:hAnsi="Consolas"/>
+                <w:sz w:val="18"/>
+                <w:szCs w:val="18"/>
+              </w:rPr>
+              <w:t xml:space="preserve">              "isDeleted": false,</w:t>
+            </w:r>
+          </w:p>
+          <w:p>
+            <w:pPr>
+              <w:spacing w:after="0" w:line="240"/>
+            </w:pPr>
+            <w:r>
+              <w:rPr>
+                <w:rFonts w:ascii="Consolas" w:cs="Consolas" w:eastAsia="Consolas" w:hAnsi="Consolas"/>
+                <w:sz w:val="18"/>
+                <w:szCs w:val="18"/>
+              </w:rPr>
+              <w:t xml:space="preserve">              "schoolCode": "SCH-1042",</w:t>
+            </w:r>
+          </w:p>
+          <w:p>
+            <w:pPr>
+              <w:spacing w:after="0" w:line="240"/>
+            </w:pPr>
+            <w:r>
+              <w:rPr>
+                <w:rFonts w:ascii="Consolas" w:cs="Consolas" w:eastAsia="Consolas" w:hAnsi="Consolas"/>
+                <w:sz w:val="18"/>
+                <w:szCs w:val="18"/>
+              </w:rPr>
+              <w:t xml:space="preserve">              "organizationCode": "ORG-88",</w:t>
+            </w:r>
+          </w:p>
+          <w:p>
+            <w:pPr>
+              <w:spacing w:after="0" w:line="240"/>
+            </w:pPr>
+            <w:r>
+              <w:rPr>
+                <w:rFonts w:ascii="Consolas" w:cs="Consolas" w:eastAsia="Consolas" w:hAnsi="Consolas"/>
+                <w:sz w:val="18"/>
+                <w:szCs w:val="18"/>
+              </w:rPr>
+              <w:t xml:space="preserve">              "createdBy": "USR-admin-7",</w:t>
+            </w:r>
+          </w:p>
+          <w:p>
+            <w:pPr>
+              <w:spacing w:after="0" w:line="240"/>
+            </w:pPr>
+            <w:r>
+              <w:rPr>
+                <w:rFonts w:ascii="Consolas" w:cs="Consolas" w:eastAsia="Consolas" w:hAnsi="Consolas"/>
+                <w:sz w:val="18"/>
+                <w:szCs w:val="18"/>
+              </w:rPr>
+              <w:t xml:space="preserve">              "updatedBy": "USR-admin-7",</w:t>
+            </w:r>
+          </w:p>
+          <w:p>
+            <w:pPr>
+              <w:spacing w:after="0" w:line="240"/>
+            </w:pPr>
+            <w:r>
+              <w:rPr>
+                <w:rFonts w:ascii="Consolas" w:cs="Consolas" w:eastAsia="Consolas" w:hAnsi="Consolas"/>
+                <w:sz w:val="18"/>
+                <w:szCs w:val="18"/>
+              </w:rPr>
+              <w:t xml:space="preserve">              "createdAt": "2026-01-12T09:00:00Z",</w:t>
+            </w:r>
+          </w:p>
+          <w:p>
+            <w:pPr>
+              <w:spacing w:after="0" w:line="240"/>
+            </w:pPr>
+            <w:r>
+              <w:rPr>
+                <w:rFonts w:ascii="Consolas" w:cs="Consolas" w:eastAsia="Consolas" w:hAnsi="Consolas"/>
+                <w:sz w:val="18"/>
+                <w:szCs w:val="18"/>
+              </w:rPr>
+              <w:t xml:space="preserve">              "updatedAt": "2026-01-12T09:00:00Z"</w:t>
+            </w:r>
+          </w:p>
+          <w:p>
+            <w:pPr>
+              <w:spacing w:after="0" w:line="240"/>
+            </w:pPr>
+            <w:r>
+              <w:rPr>
+                <w:rFonts w:ascii="Consolas" w:cs="Consolas" w:eastAsia="Consolas" w:hAnsi="Consolas"/>
+                <w:sz w:val="18"/>
+                <w:szCs w:val="18"/>
+              </w:rPr>
+              <w:t xml:space="preserve">            }</w:t>
+            </w:r>
+          </w:p>
+          <w:p>
+            <w:pPr>
+              <w:spacing w:after="0" w:line="240"/>
+            </w:pPr>
+            <w:r>
+              <w:rPr>
+                <w:rFonts w:ascii="Consolas" w:cs="Consolas" w:eastAsia="Consolas" w:hAnsi="Consolas"/>
+                <w:sz w:val="18"/>
+                <w:szCs w:val="18"/>
+              </w:rPr>
+              <w:t xml:space="preserve">          ]</w:t>
+            </w:r>
+          </w:p>
+          <w:p>
+            <w:pPr>
+              <w:spacing w:after="0" w:line="240"/>
+            </w:pPr>
+            <w:r>
+              <w:rPr>
+                <w:rFonts w:ascii="Consolas" w:cs="Consolas" w:eastAsia="Consolas" w:hAnsi="Consolas"/>
+                <w:sz w:val="18"/>
+                <w:szCs w:val="18"/>
+              </w:rPr>
+              <w:t xml:space="preserve">        }</w:t>
+            </w:r>
+          </w:p>
+          <w:p>
+            <w:pPr>
+              <w:spacing w:after="0" w:line="240"/>
+            </w:pPr>
+            <w:r>
+              <w:rPr>
+                <w:rFonts w:ascii="Consolas" w:cs="Consolas" w:eastAsia="Consolas" w:hAnsi="Consolas"/>
+                <w:sz w:val="18"/>
+                <w:szCs w:val="18"/>
+              </w:rPr>
+              <w:t xml:space="preserve">      ]</w:t>
+            </w:r>
+          </w:p>
+          <w:p>
+            <w:pPr>
+              <w:spacing w:after="0" w:line="240"/>
+            </w:pPr>
+            <w:r>
+              <w:rPr>
+                <w:rFonts w:ascii="Consolas" w:cs="Consolas" w:eastAsia="Consolas" w:hAnsi="Consolas"/>
+                <w:sz w:val="18"/>
+                <w:szCs w:val="18"/>
+              </w:rPr>
+              <w:t xml:space="preserve">    }</w:t>
+            </w:r>
+          </w:p>
+          <w:p>
+            <w:pPr>
+              <w:spacing w:after="0" w:line="240"/>
+            </w:pPr>
+            <w:r>
+              <w:rPr>
+                <w:rFonts w:ascii="Consolas" w:cs="Consolas" w:eastAsia="Consolas" w:hAnsi="Consolas"/>
+                <w:sz w:val="18"/>
+                <w:szCs w:val="18"/>
+              </w:rPr>
+              <w:t xml:space="preserve">  ]</w:t>
+            </w:r>
+          </w:p>
+          <w:p>
+            <w:pPr>
+              <w:spacing w:after="0" w:line="240"/>
+            </w:pPr>
+            <w:r>
+              <w:rPr>
+                <w:rFonts w:ascii="Consolas" w:cs="Consolas" w:eastAsia="Consolas" w:hAnsi="Consolas"/>
+                <w:sz w:val="18"/>
+                <w:szCs w:val="18"/>
+              </w:rPr>
+              <w:t xml:space="preserve">}</w:t>
+            </w:r>
+          </w:p>
+        </w:tc>
+      </w:tr>
+    </w:tbl>
+    <w:p>
+      <w:pPr>
+        <w:spacing w:after="80"/>
+      </w:pPr>
+    </w:p>
+    <w:p>
+      <w:pPr>
+        <w:spacing w:after="60"/>
+      </w:pPr>
+      <w:r>
+        <w:rPr>
+          <w:b/>
+          <w:bCs/>
+        </w:rPr>
+        <w:t xml:space="preserve">GET /assessments?classroomCode=CLS-TODDLER-A&amp;periodStart=2026-06-01&amp;periodEnd=2026-06-30</w:t>
+      </w:r>
+    </w:p>
+    <w:tbl>
+      <w:tblPr>
+        <w:tblW w:type="dxa" w:w="9360"/>
+        <w:tblBorders>
+          <w:top w:val="single" w:color="D0D7DE" w:sz="4"/>
+          <w:left w:val="single" w:color="D0D7DE" w:sz="4"/>
+          <w:bottom w:val="single" w:color="D0D7DE" w:sz="4"/>
+          <w:right w:val="single" w:color="D0D7DE" w:sz="4"/>
+          <w:insideH w:val="none"/>
+          <w:insideV w:val="none"/>
+        </w:tblBorders>
+      </w:tblPr>
+      <w:tblGrid>
+        <w:gridCol w:w="9360"/>
+      </w:tblGrid>
+      <w:tr>
+        <w:tc>
+          <w:tcPr>
+            <w:tcW w:type="dxa" w:w="9360"/>
+            <w:shd w:fill="F6F8FA" w:val="clear"/>
+            <w:tcMar>
+              <w:top w:type="dxa" w:w="120"/>
+              <w:left w:type="dxa" w:w="160"/>
+              <w:bottom w:type="dxa" w:w="120"/>
+              <w:right w:type="dxa" w:w="160"/>
+            </w:tcMar>
+          </w:tcPr>
+          <w:p>
+            <w:pPr>
+              <w:spacing w:after="0" w:line="240"/>
+            </w:pPr>
+            <w:r>
+              <w:rPr>
+                <w:rFonts w:ascii="Consolas" w:cs="Consolas" w:eastAsia="Consolas" w:hAnsi="Consolas"/>
+                <w:sz w:val="18"/>
+                <w:szCs w:val="18"/>
+              </w:rPr>
+              <w:t xml:space="preserve">{</w:t>
+            </w:r>
+          </w:p>
+          <w:p>
+            <w:pPr>
+              <w:spacing w:after="0" w:line="240"/>
+            </w:pPr>
+            <w:r>
+              <w:rPr>
+                <w:rFonts w:ascii="Consolas" w:cs="Consolas" w:eastAsia="Consolas" w:hAnsi="Consolas"/>
+                <w:sz w:val="18"/>
+                <w:szCs w:val="18"/>
+              </w:rPr>
+              <w:t xml:space="preserve">  "period": { "start": "2026-06-01", "end": "2026-06-30" },</w:t>
+            </w:r>
+          </w:p>
+          <w:p>
+            <w:pPr>
+              <w:spacing w:after="0" w:line="240"/>
+            </w:pPr>
+            <w:r>
+              <w:rPr>
+                <w:rFonts w:ascii="Consolas" w:cs="Consolas" w:eastAsia="Consolas" w:hAnsi="Consolas"/>
+                <w:sz w:val="18"/>
+                <w:szCs w:val="18"/>
+              </w:rPr>
+              <w:t xml:space="preserve">  "items": [</w:t>
+            </w:r>
+          </w:p>
+          <w:p>
+            <w:pPr>
+              <w:spacing w:after="0" w:line="240"/>
+            </w:pPr>
+            <w:r>
+              <w:rPr>
+                <w:rFonts w:ascii="Consolas" w:cs="Consolas" w:eastAsia="Consolas" w:hAnsi="Consolas"/>
+                <w:sz w:val="18"/>
+                <w:szCs w:val="18"/>
+              </w:rPr>
+              <w:t xml:space="preserve">    {</w:t>
+            </w:r>
+          </w:p>
+          <w:p>
+            <w:pPr>
+              <w:spacing w:after="0" w:line="240"/>
+            </w:pPr>
+            <w:r>
+              <w:rPr>
+                <w:rFonts w:ascii="Consolas" w:cs="Consolas" w:eastAsia="Consolas" w:hAnsi="Consolas"/>
+                <w:sz w:val="18"/>
+                <w:szCs w:val="18"/>
+              </w:rPr>
+              <w:t xml:space="preserve">      "id": "a1...-assessment-uuid",</w:t>
+            </w:r>
+          </w:p>
+          <w:p>
+            <w:pPr>
+              <w:spacing w:after="0" w:line="240"/>
+            </w:pPr>
+            <w:r>
+              <w:rPr>
+                <w:rFonts w:ascii="Consolas" w:cs="Consolas" w:eastAsia="Consolas" w:hAnsi="Consolas"/>
+                <w:sz w:val="18"/>
+                <w:szCs w:val="18"/>
+              </w:rPr>
+              <w:t xml:space="preserve">      "studentCode": "STU-30567",</w:t>
+            </w:r>
+          </w:p>
+          <w:p>
+            <w:pPr>
+              <w:spacing w:after="0" w:line="240"/>
+            </w:pPr>
+            <w:r>
+              <w:rPr>
+                <w:rFonts w:ascii="Consolas" w:cs="Consolas" w:eastAsia="Consolas" w:hAnsi="Consolas"/>
+                <w:sz w:val="18"/>
+                <w:szCs w:val="18"/>
+              </w:rPr>
+              <w:t xml:space="preserve">      "milestoneId": "m1c2...-milestone-uuid",</w:t>
+            </w:r>
+          </w:p>
+          <w:p>
+            <w:pPr>
+              <w:spacing w:after="0" w:line="240"/>
+            </w:pPr>
+            <w:r>
+              <w:rPr>
+                <w:rFonts w:ascii="Consolas" w:cs="Consolas" w:eastAsia="Consolas" w:hAnsi="Consolas"/>
+                <w:sz w:val="18"/>
+                <w:szCs w:val="18"/>
+              </w:rPr>
+              <w:t xml:space="preserve">      "subdomainId": "s1b2...-subdomain-uuid",</w:t>
+            </w:r>
+          </w:p>
+          <w:p>
+            <w:pPr>
+              <w:spacing w:after="0" w:line="240"/>
+            </w:pPr>
+            <w:r>
+              <w:rPr>
+                <w:rFonts w:ascii="Consolas" w:cs="Consolas" w:eastAsia="Consolas" w:hAnsi="Consolas"/>
+                <w:sz w:val="18"/>
+                <w:szCs w:val="18"/>
+              </w:rPr>
+              <w:t xml:space="preserve">      "domainId": "d1a2...-domain-uuid",</w:t>
+            </w:r>
+          </w:p>
+          <w:p>
+            <w:pPr>
+              <w:spacing w:after="0" w:line="240"/>
+            </w:pPr>
+            <w:r>
+              <w:rPr>
+                <w:rFonts w:ascii="Consolas" w:cs="Consolas" w:eastAsia="Consolas" w:hAnsi="Consolas"/>
+                <w:sz w:val="18"/>
+                <w:szCs w:val="18"/>
+              </w:rPr>
+              <w:t xml:space="preserve">      "score": 4,</w:t>
+            </w:r>
+          </w:p>
+          <w:p>
+            <w:pPr>
+              <w:spacing w:after="0" w:line="240"/>
+            </w:pPr>
+            <w:r>
+              <w:rPr>
+                <w:rFonts w:ascii="Consolas" w:cs="Consolas" w:eastAsia="Consolas" w:hAnsi="Consolas"/>
+                <w:sz w:val="18"/>
+                <w:szCs w:val="18"/>
+              </w:rPr>
+              <w:t xml:space="preserve">      "notes": "Consistently seeks comfort and settles quickly.",</w:t>
+            </w:r>
+          </w:p>
+          <w:p>
+            <w:pPr>
+              <w:spacing w:after="0" w:line="240"/>
+            </w:pPr>
+            <w:r>
+              <w:rPr>
+                <w:rFonts w:ascii="Consolas" w:cs="Consolas" w:eastAsia="Consolas" w:hAnsi="Consolas"/>
+                <w:sz w:val="18"/>
+                <w:szCs w:val="18"/>
+              </w:rPr>
+              <w:t xml:space="preserve">      "isPublished": true,</w:t>
+            </w:r>
+          </w:p>
+          <w:p>
+            <w:pPr>
+              <w:spacing w:after="0" w:line="240"/>
+            </w:pPr>
+            <w:r>
+              <w:rPr>
+                <w:rFonts w:ascii="Consolas" w:cs="Consolas" w:eastAsia="Consolas" w:hAnsi="Consolas"/>
+                <w:sz w:val="18"/>
+                <w:szCs w:val="18"/>
+              </w:rPr>
+              <w:t xml:space="preserve">      "assessedBy": "USR-staff-19",</w:t>
+            </w:r>
+          </w:p>
+          <w:p>
+            <w:pPr>
+              <w:spacing w:after="0" w:line="240"/>
+            </w:pPr>
+            <w:r>
+              <w:rPr>
+                <w:rFonts w:ascii="Consolas" w:cs="Consolas" w:eastAsia="Consolas" w:hAnsi="Consolas"/>
+                <w:sz w:val="18"/>
+                <w:szCs w:val="18"/>
+              </w:rPr>
+              <w:t xml:space="preserve">      "assessedAt": "2026-06-18T11:05:00Z",</w:t>
+            </w:r>
+          </w:p>
+          <w:p>
+            <w:pPr>
+              <w:spacing w:after="0" w:line="240"/>
+            </w:pPr>
+            <w:r>
+              <w:rPr>
+                <w:rFonts w:ascii="Consolas" w:cs="Consolas" w:eastAsia="Consolas" w:hAnsi="Consolas"/>
+                <w:sz w:val="18"/>
+                <w:szCs w:val="18"/>
+              </w:rPr>
+              <w:t xml:space="preserve">      "periodStart": "2026-06-01",</w:t>
+            </w:r>
+          </w:p>
+          <w:p>
+            <w:pPr>
+              <w:spacing w:after="0" w:line="240"/>
+            </w:pPr>
+            <w:r>
+              <w:rPr>
+                <w:rFonts w:ascii="Consolas" w:cs="Consolas" w:eastAsia="Consolas" w:hAnsi="Consolas"/>
+                <w:sz w:val="18"/>
+                <w:szCs w:val="18"/>
+              </w:rPr>
+              <w:t xml:space="preserve">      "periodEnd": "2026-06-30",</w:t>
+            </w:r>
+          </w:p>
+          <w:p>
+            <w:pPr>
+              <w:spacing w:after="0" w:line="240"/>
+            </w:pPr>
+            <w:r>
+              <w:rPr>
+                <w:rFonts w:ascii="Consolas" w:cs="Consolas" w:eastAsia="Consolas" w:hAnsi="Consolas"/>
+                <w:sz w:val="18"/>
+                <w:szCs w:val="18"/>
+              </w:rPr>
+              <w:t xml:space="preserve">      "schoolCode": "SCH-1042",</w:t>
+            </w:r>
+          </w:p>
+          <w:p>
+            <w:pPr>
+              <w:spacing w:after="0" w:line="240"/>
+            </w:pPr>
+            <w:r>
+              <w:rPr>
+                <w:rFonts w:ascii="Consolas" w:cs="Consolas" w:eastAsia="Consolas" w:hAnsi="Consolas"/>
+                <w:sz w:val="18"/>
+                <w:szCs w:val="18"/>
+              </w:rPr>
+              <w:t xml:space="preserve">      "organizationCode": "ORG-88",</w:t>
+            </w:r>
+          </w:p>
+          <w:p>
+            <w:pPr>
+              <w:spacing w:after="0" w:line="240"/>
+            </w:pPr>
+            <w:r>
+              <w:rPr>
+                <w:rFonts w:ascii="Consolas" w:cs="Consolas" w:eastAsia="Consolas" w:hAnsi="Consolas"/>
+                <w:sz w:val="18"/>
+                <w:szCs w:val="18"/>
+              </w:rPr>
+              <w:t xml:space="preserve">      "impersonatorCode": null</w:t>
+            </w:r>
+          </w:p>
+          <w:p>
+            <w:pPr>
+              <w:spacing w:after="0" w:line="240"/>
+            </w:pPr>
+            <w:r>
+              <w:rPr>
+                <w:rFonts w:ascii="Consolas" w:cs="Consolas" w:eastAsia="Consolas" w:hAnsi="Consolas"/>
+                <w:sz w:val="18"/>
+                <w:szCs w:val="18"/>
+              </w:rPr>
+              <w:t xml:space="preserve">    },</w:t>
+            </w:r>
+          </w:p>
+          <w:p>
+            <w:pPr>
+              <w:spacing w:after="0" w:line="240"/>
+            </w:pPr>
+            <w:r>
+              <w:rPr>
+                <w:rFonts w:ascii="Consolas" w:cs="Consolas" w:eastAsia="Consolas" w:hAnsi="Consolas"/>
+                <w:sz w:val="18"/>
+                <w:szCs w:val="18"/>
+              </w:rPr>
+              <w:t xml:space="preserve">    {</w:t>
+            </w:r>
+          </w:p>
+          <w:p>
+            <w:pPr>
+              <w:spacing w:after="0" w:line="240"/>
+            </w:pPr>
+            <w:r>
+              <w:rPr>
+                <w:rFonts w:ascii="Consolas" w:cs="Consolas" w:eastAsia="Consolas" w:hAnsi="Consolas"/>
+                <w:sz w:val="18"/>
+                <w:szCs w:val="18"/>
+              </w:rPr>
+              <w:t xml:space="preserve">      "id": "a2...-assessment-uuid",</w:t>
+            </w:r>
+          </w:p>
+          <w:p>
+            <w:pPr>
+              <w:spacing w:after="0" w:line="240"/>
+            </w:pPr>
+            <w:r>
+              <w:rPr>
+                <w:rFonts w:ascii="Consolas" w:cs="Consolas" w:eastAsia="Consolas" w:hAnsi="Consolas"/>
+                <w:sz w:val="18"/>
+                <w:szCs w:val="18"/>
+              </w:rPr>
+              <w:t xml:space="preserve">      "studentCode": "STU-30568",</w:t>
+            </w:r>
+          </w:p>
+          <w:p>
+            <w:pPr>
+              <w:spacing w:after="0" w:line="240"/>
+            </w:pPr>
+            <w:r>
+              <w:rPr>
+                <w:rFonts w:ascii="Consolas" w:cs="Consolas" w:eastAsia="Consolas" w:hAnsi="Consolas"/>
+                <w:sz w:val="18"/>
+                <w:szCs w:val="18"/>
+              </w:rPr>
+              <w:t xml:space="preserve">      "milestoneId": "m1c2...-milestone-uuid",</w:t>
+            </w:r>
+          </w:p>
+          <w:p>
+            <w:pPr>
+              <w:spacing w:after="0" w:line="240"/>
+            </w:pPr>
+            <w:r>
+              <w:rPr>
+                <w:rFonts w:ascii="Consolas" w:cs="Consolas" w:eastAsia="Consolas" w:hAnsi="Consolas"/>
+                <w:sz w:val="18"/>
+                <w:szCs w:val="18"/>
+              </w:rPr>
+              <w:t xml:space="preserve">      "subdomainId": "s1b2...-subdomain-uuid",</w:t>
+            </w:r>
+          </w:p>
+          <w:p>
+            <w:pPr>
+              <w:spacing w:after="0" w:line="240"/>
+            </w:pPr>
+            <w:r>
+              <w:rPr>
+                <w:rFonts w:ascii="Consolas" w:cs="Consolas" w:eastAsia="Consolas" w:hAnsi="Consolas"/>
+                <w:sz w:val="18"/>
+                <w:szCs w:val="18"/>
+              </w:rPr>
+              <w:t xml:space="preserve">      "domainId": "d1a2...-domain-uuid",</w:t>
+            </w:r>
+          </w:p>
+          <w:p>
+            <w:pPr>
+              <w:spacing w:after="0" w:line="240"/>
+            </w:pPr>
+            <w:r>
+              <w:rPr>
+                <w:rFonts w:ascii="Consolas" w:cs="Consolas" w:eastAsia="Consolas" w:hAnsi="Consolas"/>
+                <w:sz w:val="18"/>
+                <w:szCs w:val="18"/>
+              </w:rPr>
+              <w:t xml:space="preserve">      "score": 2,</w:t>
+            </w:r>
+          </w:p>
+          <w:p>
+            <w:pPr>
+              <w:spacing w:after="0" w:line="240"/>
+            </w:pPr>
+            <w:r>
+              <w:rPr>
+                <w:rFonts w:ascii="Consolas" w:cs="Consolas" w:eastAsia="Consolas" w:hAnsi="Consolas"/>
+                <w:sz w:val="18"/>
+                <w:szCs w:val="18"/>
+              </w:rPr>
+              <w:t xml:space="preserve">      "notes": null,</w:t>
+            </w:r>
+          </w:p>
+          <w:p>
+            <w:pPr>
+              <w:spacing w:after="0" w:line="240"/>
+            </w:pPr>
+            <w:r>
+              <w:rPr>
+                <w:rFonts w:ascii="Consolas" w:cs="Consolas" w:eastAsia="Consolas" w:hAnsi="Consolas"/>
+                <w:sz w:val="18"/>
+                <w:szCs w:val="18"/>
+              </w:rPr>
+              <w:t xml:space="preserve">      "isPublished": false,</w:t>
+            </w:r>
+          </w:p>
+          <w:p>
+            <w:pPr>
+              <w:spacing w:after="0" w:line="240"/>
+            </w:pPr>
+            <w:r>
+              <w:rPr>
+                <w:rFonts w:ascii="Consolas" w:cs="Consolas" w:eastAsia="Consolas" w:hAnsi="Consolas"/>
+                <w:sz w:val="18"/>
+                <w:szCs w:val="18"/>
+              </w:rPr>
+              <w:t xml:space="preserve">      "assessedBy": "USR-staff-19",</w:t>
+            </w:r>
+          </w:p>
+          <w:p>
+            <w:pPr>
+              <w:spacing w:after="0" w:line="240"/>
+            </w:pPr>
+            <w:r>
+              <w:rPr>
+                <w:rFonts w:ascii="Consolas" w:cs="Consolas" w:eastAsia="Consolas" w:hAnsi="Consolas"/>
+                <w:sz w:val="18"/>
+                <w:szCs w:val="18"/>
+              </w:rPr>
+              <w:t xml:space="preserve">      "assessedAt": "2026-06-18T11:07:20Z",</w:t>
+            </w:r>
+          </w:p>
+          <w:p>
+            <w:pPr>
+              <w:spacing w:after="0" w:line="240"/>
+            </w:pPr>
+            <w:r>
+              <w:rPr>
+                <w:rFonts w:ascii="Consolas" w:cs="Consolas" w:eastAsia="Consolas" w:hAnsi="Consolas"/>
+                <w:sz w:val="18"/>
+                <w:szCs w:val="18"/>
+              </w:rPr>
+              <w:t xml:space="preserve">      "periodStart": "2026-06-01",</w:t>
+            </w:r>
+          </w:p>
+          <w:p>
+            <w:pPr>
+              <w:spacing w:after="0" w:line="240"/>
+            </w:pPr>
+            <w:r>
+              <w:rPr>
+                <w:rFonts w:ascii="Consolas" w:cs="Consolas" w:eastAsia="Consolas" w:hAnsi="Consolas"/>
+                <w:sz w:val="18"/>
+                <w:szCs w:val="18"/>
+              </w:rPr>
+              <w:t xml:space="preserve">      "periodEnd": "2026-06-30",</w:t>
+            </w:r>
+          </w:p>
+          <w:p>
+            <w:pPr>
+              <w:spacing w:after="0" w:line="240"/>
+            </w:pPr>
+            <w:r>
+              <w:rPr>
+                <w:rFonts w:ascii="Consolas" w:cs="Consolas" w:eastAsia="Consolas" w:hAnsi="Consolas"/>
+                <w:sz w:val="18"/>
+                <w:szCs w:val="18"/>
+              </w:rPr>
+              <w:t xml:space="preserve">      "schoolCode": "SCH-1042",</w:t>
+            </w:r>
+          </w:p>
+          <w:p>
+            <w:pPr>
+              <w:spacing w:after="0" w:line="240"/>
+            </w:pPr>
+            <w:r>
+              <w:rPr>
+                <w:rFonts w:ascii="Consolas" w:cs="Consolas" w:eastAsia="Consolas" w:hAnsi="Consolas"/>
+                <w:sz w:val="18"/>
+                <w:szCs w:val="18"/>
+              </w:rPr>
+              <w:t xml:space="preserve">      "organizationCode": "ORG-88",</w:t>
+            </w:r>
+          </w:p>
+          <w:p>
+            <w:pPr>
+              <w:spacing w:after="0" w:line="240"/>
+            </w:pPr>
+            <w:r>
+              <w:rPr>
+                <w:rFonts w:ascii="Consolas" w:cs="Consolas" w:eastAsia="Consolas" w:hAnsi="Consolas"/>
+                <w:sz w:val="18"/>
+                <w:szCs w:val="18"/>
+              </w:rPr>
+              <w:t xml:space="preserve">      "impersonatorCode": "USR-cww-superadmin-1"</w:t>
+            </w:r>
+          </w:p>
+          <w:p>
+            <w:pPr>
+              <w:spacing w:after="0" w:line="240"/>
+            </w:pPr>
+            <w:r>
+              <w:rPr>
+                <w:rFonts w:ascii="Consolas" w:cs="Consolas" w:eastAsia="Consolas" w:hAnsi="Consolas"/>
+                <w:sz w:val="18"/>
+                <w:szCs w:val="18"/>
+              </w:rPr>
+              <w:t xml:space="preserve">    }</w:t>
+            </w:r>
+          </w:p>
+          <w:p>
+            <w:pPr>
+              <w:spacing w:after="0" w:line="240"/>
+            </w:pPr>
+            <w:r>
+              <w:rPr>
+                <w:rFonts w:ascii="Consolas" w:cs="Consolas" w:eastAsia="Consolas" w:hAnsi="Consolas"/>
+                <w:sz w:val="18"/>
+                <w:szCs w:val="18"/>
+              </w:rPr>
+              <w:t xml:space="preserve">  ]</w:t>
+            </w:r>
+          </w:p>
+          <w:p>
+            <w:pPr>
+              <w:spacing w:after="0" w:line="240"/>
+            </w:pPr>
+            <w:r>
+              <w:rPr>
+                <w:rFonts w:ascii="Consolas" w:cs="Consolas" w:eastAsia="Consolas" w:hAnsi="Consolas"/>
+                <w:sz w:val="18"/>
+                <w:szCs w:val="18"/>
+              </w:rPr>
+              <w:t xml:space="preserve">}</w:t>
+            </w:r>
+          </w:p>
+        </w:tc>
+      </w:tr>
+    </w:tbl>
+    <w:p>
+      <w:pPr>
+        <w:spacing w:after="80"/>
+      </w:pPr>
+    </w:p>
+    <w:p>
+      <w:pPr>
+        <w:spacing w:after="60"/>
+      </w:pPr>
+      <w:r>
+        <w:rPr>
+          <w:b/>
+          <w:bCs/>
+        </w:rPr>
+        <w:t xml:space="preserve">POST /assessments/bulk — response (persisted records with server ids)</w:t>
+      </w:r>
+    </w:p>
+    <w:tbl>
+      <w:tblPr>
+        <w:tblW w:type="dxa" w:w="9360"/>
+        <w:tblBorders>
+          <w:top w:val="single" w:color="D0D7DE" w:sz="4"/>
+          <w:left w:val="single" w:color="D0D7DE" w:sz="4"/>
+          <w:bottom w:val="single" w:color="D0D7DE" w:sz="4"/>
+          <w:right w:val="single" w:color="D0D7DE" w:sz="4"/>
+          <w:insideH w:val="none"/>
+          <w:insideV w:val="none"/>
+        </w:tblBorders>
+      </w:tblPr>
+      <w:tblGrid>
+        <w:gridCol w:w="9360"/>
+      </w:tblGrid>
+      <w:tr>
+        <w:tc>
+          <w:tcPr>
+            <w:tcW w:type="dxa" w:w="9360"/>
+            <w:shd w:fill="F6F8FA" w:val="clear"/>
+            <w:tcMar>
+              <w:top w:type="dxa" w:w="120"/>
+              <w:left w:type="dxa" w:w="160"/>
+              <w:bottom w:type="dxa" w:w="120"/>
+              <w:right w:type="dxa" w:w="160"/>
+            </w:tcMar>
+          </w:tcPr>
+          <w:p>
+            <w:pPr>
+              <w:spacing w:after="0" w:line="240"/>
+            </w:pPr>
+            <w:r>
+              <w:rPr>
+                <w:rFonts w:ascii="Consolas" w:cs="Consolas" w:eastAsia="Consolas" w:hAnsi="Consolas"/>
+                <w:sz w:val="18"/>
+                <w:szCs w:val="18"/>
+              </w:rPr>
+              <w:t xml:space="preserve">{</w:t>
+            </w:r>
+          </w:p>
+          <w:p>
+            <w:pPr>
+              <w:spacing w:after="0" w:line="240"/>
+            </w:pPr>
+            <w:r>
+              <w:rPr>
+                <w:rFonts w:ascii="Consolas" w:cs="Consolas" w:eastAsia="Consolas" w:hAnsi="Consolas"/>
+                <w:sz w:val="18"/>
+                <w:szCs w:val="18"/>
+              </w:rPr>
+              <w:t xml:space="preserve">  "periodStart": "2026-06-01",</w:t>
+            </w:r>
+          </w:p>
+          <w:p>
+            <w:pPr>
+              <w:spacing w:after="0" w:line="240"/>
+            </w:pPr>
+            <w:r>
+              <w:rPr>
+                <w:rFonts w:ascii="Consolas" w:cs="Consolas" w:eastAsia="Consolas" w:hAnsi="Consolas"/>
+                <w:sz w:val="18"/>
+                <w:szCs w:val="18"/>
+              </w:rPr>
+              <w:t xml:space="preserve">  "periodEnd": "2026-06-30",</w:t>
+            </w:r>
+          </w:p>
+          <w:p>
+            <w:pPr>
+              <w:spacing w:after="0" w:line="240"/>
+            </w:pPr>
+            <w:r>
+              <w:rPr>
+                <w:rFonts w:ascii="Consolas" w:cs="Consolas" w:eastAsia="Consolas" w:hAnsi="Consolas"/>
+                <w:sz w:val="18"/>
+                <w:szCs w:val="18"/>
+              </w:rPr>
+              <w:t xml:space="preserve">  "persisted": [</w:t>
+            </w:r>
+          </w:p>
+          <w:p>
+            <w:pPr>
+              <w:spacing w:after="0" w:line="240"/>
+            </w:pPr>
+            <w:r>
+              <w:rPr>
+                <w:rFonts w:ascii="Consolas" w:cs="Consolas" w:eastAsia="Consolas" w:hAnsi="Consolas"/>
+                <w:sz w:val="18"/>
+                <w:szCs w:val="18"/>
+              </w:rPr>
+              <w:t xml:space="preserve">    {</w:t>
+            </w:r>
+          </w:p>
+          <w:p>
+            <w:pPr>
+              <w:spacing w:after="0" w:line="240"/>
+            </w:pPr>
+            <w:r>
+              <w:rPr>
+                <w:rFonts w:ascii="Consolas" w:cs="Consolas" w:eastAsia="Consolas" w:hAnsi="Consolas"/>
+                <w:sz w:val="18"/>
+                <w:szCs w:val="18"/>
+              </w:rPr>
+              <w:t xml:space="preserve">      "id": "a9...-assessment-uuid",</w:t>
+            </w:r>
+          </w:p>
+          <w:p>
+            <w:pPr>
+              <w:spacing w:after="0" w:line="240"/>
+            </w:pPr>
+            <w:r>
+              <w:rPr>
+                <w:rFonts w:ascii="Consolas" w:cs="Consolas" w:eastAsia="Consolas" w:hAnsi="Consolas"/>
+                <w:sz w:val="18"/>
+                <w:szCs w:val="18"/>
+              </w:rPr>
+              <w:t xml:space="preserve">      "studentCode": "STU-30567",</w:t>
+            </w:r>
+          </w:p>
+          <w:p>
+            <w:pPr>
+              <w:spacing w:after="0" w:line="240"/>
+            </w:pPr>
+            <w:r>
+              <w:rPr>
+                <w:rFonts w:ascii="Consolas" w:cs="Consolas" w:eastAsia="Consolas" w:hAnsi="Consolas"/>
+                <w:sz w:val="18"/>
+                <w:szCs w:val="18"/>
+              </w:rPr>
+              <w:t xml:space="preserve">      "milestoneId": "m1c2...-milestone-uuid",</w:t>
+            </w:r>
+          </w:p>
+          <w:p>
+            <w:pPr>
+              <w:spacing w:after="0" w:line="240"/>
+            </w:pPr>
+            <w:r>
+              <w:rPr>
+                <w:rFonts w:ascii="Consolas" w:cs="Consolas" w:eastAsia="Consolas" w:hAnsi="Consolas"/>
+                <w:sz w:val="18"/>
+                <w:szCs w:val="18"/>
+              </w:rPr>
+              <w:t xml:space="preserve">      "subdomainId": "s1b2...-subdomain-uuid",</w:t>
+            </w:r>
+          </w:p>
+          <w:p>
+            <w:pPr>
+              <w:spacing w:after="0" w:line="240"/>
+            </w:pPr>
+            <w:r>
+              <w:rPr>
+                <w:rFonts w:ascii="Consolas" w:cs="Consolas" w:eastAsia="Consolas" w:hAnsi="Consolas"/>
+                <w:sz w:val="18"/>
+                <w:szCs w:val="18"/>
+              </w:rPr>
+              <w:t xml:space="preserve">      "domainId": "d1a2...-domain-uuid",</w:t>
+            </w:r>
+          </w:p>
+          <w:p>
+            <w:pPr>
+              <w:spacing w:after="0" w:line="240"/>
+            </w:pPr>
+            <w:r>
+              <w:rPr>
+                <w:rFonts w:ascii="Consolas" w:cs="Consolas" w:eastAsia="Consolas" w:hAnsi="Consolas"/>
+                <w:sz w:val="18"/>
+                <w:szCs w:val="18"/>
+              </w:rPr>
+              <w:t xml:space="preserve">      "score": 5,</w:t>
+            </w:r>
+          </w:p>
+          <w:p>
+            <w:pPr>
+              <w:spacing w:after="0" w:line="240"/>
+            </w:pPr>
+            <w:r>
+              <w:rPr>
+                <w:rFonts w:ascii="Consolas" w:cs="Consolas" w:eastAsia="Consolas" w:hAnsi="Consolas"/>
+                <w:sz w:val="18"/>
+                <w:szCs w:val="18"/>
+              </w:rPr>
+              <w:t xml:space="preserve">      "notes": "optional",</w:t>
+            </w:r>
+          </w:p>
+          <w:p>
+            <w:pPr>
+              <w:spacing w:after="0" w:line="240"/>
+            </w:pPr>
+            <w:r>
+              <w:rPr>
+                <w:rFonts w:ascii="Consolas" w:cs="Consolas" w:eastAsia="Consolas" w:hAnsi="Consolas"/>
+                <w:sz w:val="18"/>
+                <w:szCs w:val="18"/>
+              </w:rPr>
+              <w:t xml:space="preserve">      "isPublished": false,</w:t>
+            </w:r>
+          </w:p>
+          <w:p>
+            <w:pPr>
+              <w:spacing w:after="0" w:line="240"/>
+            </w:pPr>
+            <w:r>
+              <w:rPr>
+                <w:rFonts w:ascii="Consolas" w:cs="Consolas" w:eastAsia="Consolas" w:hAnsi="Consolas"/>
+                <w:sz w:val="18"/>
+                <w:szCs w:val="18"/>
+              </w:rPr>
+              <w:t xml:space="preserve">      "assessedBy": "USR-staff-19",</w:t>
+            </w:r>
+          </w:p>
+          <w:p>
+            <w:pPr>
+              <w:spacing w:after="0" w:line="240"/>
+            </w:pPr>
+            <w:r>
+              <w:rPr>
+                <w:rFonts w:ascii="Consolas" w:cs="Consolas" w:eastAsia="Consolas" w:hAnsi="Consolas"/>
+                <w:sz w:val="18"/>
+                <w:szCs w:val="18"/>
+              </w:rPr>
+              <w:t xml:space="preserve">      "assessedAt": "2026-06-30T16:40:00Z",</w:t>
+            </w:r>
+          </w:p>
+          <w:p>
+            <w:pPr>
+              <w:spacing w:after="0" w:line="240"/>
+            </w:pPr>
+            <w:r>
+              <w:rPr>
+                <w:rFonts w:ascii="Consolas" w:cs="Consolas" w:eastAsia="Consolas" w:hAnsi="Consolas"/>
+                <w:sz w:val="18"/>
+                <w:szCs w:val="18"/>
+              </w:rPr>
+              <w:t xml:space="preserve">      "schoolCode": "SCH-1042",</w:t>
+            </w:r>
+          </w:p>
+          <w:p>
+            <w:pPr>
+              <w:spacing w:after="0" w:line="240"/>
+            </w:pPr>
+            <w:r>
+              <w:rPr>
+                <w:rFonts w:ascii="Consolas" w:cs="Consolas" w:eastAsia="Consolas" w:hAnsi="Consolas"/>
+                <w:sz w:val="18"/>
+                <w:szCs w:val="18"/>
+              </w:rPr>
+              <w:t xml:space="preserve">      "organizationCode": "ORG-88",</w:t>
+            </w:r>
+          </w:p>
+          <w:p>
+            <w:pPr>
+              <w:spacing w:after="0" w:line="240"/>
+            </w:pPr>
+            <w:r>
+              <w:rPr>
+                <w:rFonts w:ascii="Consolas" w:cs="Consolas" w:eastAsia="Consolas" w:hAnsi="Consolas"/>
+                <w:sz w:val="18"/>
+                <w:szCs w:val="18"/>
+              </w:rPr>
+              <w:t xml:space="preserve">      "impersonatorCode": null</w:t>
+            </w:r>
+          </w:p>
+          <w:p>
+            <w:pPr>
+              <w:spacing w:after="0" w:line="240"/>
+            </w:pPr>
+            <w:r>
+              <w:rPr>
+                <w:rFonts w:ascii="Consolas" w:cs="Consolas" w:eastAsia="Consolas" w:hAnsi="Consolas"/>
+                <w:sz w:val="18"/>
+                <w:szCs w:val="18"/>
+              </w:rPr>
+              <w:t xml:space="preserve">    }</w:t>
+            </w:r>
+          </w:p>
+          <w:p>
+            <w:pPr>
+              <w:spacing w:after="0" w:line="240"/>
+            </w:pPr>
+            <w:r>
+              <w:rPr>
+                <w:rFonts w:ascii="Consolas" w:cs="Consolas" w:eastAsia="Consolas" w:hAnsi="Consolas"/>
+                <w:sz w:val="18"/>
+                <w:szCs w:val="18"/>
+              </w:rPr>
+              <w:t xml:space="preserve">  ]</w:t>
+            </w:r>
+          </w:p>
+          <w:p>
+            <w:pPr>
+              <w:spacing w:after="0" w:line="240"/>
+            </w:pPr>
+            <w:r>
+              <w:rPr>
+                <w:rFonts w:ascii="Consolas" w:cs="Consolas" w:eastAsia="Consolas" w:hAnsi="Consolas"/>
+                <w:sz w:val="18"/>
+                <w:szCs w:val="18"/>
+              </w:rPr>
+              <w:t xml:space="preserve">}</w:t>
+            </w:r>
+          </w:p>
+        </w:tc>
+      </w:tr>
+    </w:tbl>
+    <w:p>
+      <w:pPr>
+        <w:spacing w:after="80"/>
+      </w:pPr>
+    </w:p>
+    <w:p>
+      <w:pPr>
+        <w:spacing w:after="60"/>
+      </w:pPr>
+      <w:r>
+        <w:rPr>
+          <w:b/>
+          <w:bCs/>
+        </w:rPr>
+        <w:t xml:space="preserve">GET /assessments/classroom/CLS-TODDLER-A?periodStart=2026-06-01&amp;periodEnd=2026-06-30 — server-aggregated rollup</w:t>
+      </w:r>
+    </w:p>
+    <w:tbl>
+      <w:tblPr>
+        <w:tblW w:type="dxa" w:w="9360"/>
+        <w:tblBorders>
+          <w:top w:val="single" w:color="D0D7DE" w:sz="4"/>
+          <w:left w:val="single" w:color="D0D7DE" w:sz="4"/>
+          <w:bottom w:val="single" w:color="D0D7DE" w:sz="4"/>
+          <w:right w:val="single" w:color="D0D7DE" w:sz="4"/>
+          <w:insideH w:val="none"/>
+          <w:insideV w:val="none"/>
+        </w:tblBorders>
+      </w:tblPr>
+      <w:tblGrid>
+        <w:gridCol w:w="9360"/>
+      </w:tblGrid>
+      <w:tr>
+        <w:tc>
+          <w:tcPr>
+            <w:tcW w:type="dxa" w:w="9360"/>
+            <w:shd w:fill="F6F8FA" w:val="clear"/>
+            <w:tcMar>
+              <w:top w:type="dxa" w:w="120"/>
+              <w:left w:type="dxa" w:w="160"/>
+              <w:bottom w:type="dxa" w:w="120"/>
+              <w:right w:type="dxa" w:w="160"/>
+            </w:tcMar>
+          </w:tcPr>
+          <w:p>
+            <w:pPr>
+              <w:spacing w:after="0" w:line="240"/>
+            </w:pPr>
+            <w:r>
+              <w:rPr>
+                <w:rFonts w:ascii="Consolas" w:cs="Consolas" w:eastAsia="Consolas" w:hAnsi="Consolas"/>
+                <w:sz w:val="18"/>
+                <w:szCs w:val="18"/>
+              </w:rPr>
+              <w:t xml:space="preserve">{</w:t>
+            </w:r>
+          </w:p>
+          <w:p>
+            <w:pPr>
+              <w:spacing w:after="0" w:line="240"/>
+            </w:pPr>
+            <w:r>
+              <w:rPr>
+                <w:rFonts w:ascii="Consolas" w:cs="Consolas" w:eastAsia="Consolas" w:hAnsi="Consolas"/>
+                <w:sz w:val="18"/>
+                <w:szCs w:val="18"/>
+              </w:rPr>
+              <w:t xml:space="preserve">  "classroomCode": "CLS-TODDLER-A",</w:t>
+            </w:r>
+          </w:p>
+          <w:p>
+            <w:pPr>
+              <w:spacing w:after="0" w:line="240"/>
+            </w:pPr>
+            <w:r>
+              <w:rPr>
+                <w:rFonts w:ascii="Consolas" w:cs="Consolas" w:eastAsia="Consolas" w:hAnsi="Consolas"/>
+                <w:sz w:val="18"/>
+                <w:szCs w:val="18"/>
+              </w:rPr>
+              <w:t xml:space="preserve">  "schoolCode": "SCH-1042",</w:t>
+            </w:r>
+          </w:p>
+          <w:p>
+            <w:pPr>
+              <w:spacing w:after="0" w:line="240"/>
+            </w:pPr>
+            <w:r>
+              <w:rPr>
+                <w:rFonts w:ascii="Consolas" w:cs="Consolas" w:eastAsia="Consolas" w:hAnsi="Consolas"/>
+                <w:sz w:val="18"/>
+                <w:szCs w:val="18"/>
+              </w:rPr>
+              <w:t xml:space="preserve">  "organizationCode": "ORG-88",</w:t>
+            </w:r>
+          </w:p>
+          <w:p>
+            <w:pPr>
+              <w:spacing w:after="0" w:line="240"/>
+            </w:pPr>
+            <w:r>
+              <w:rPr>
+                <w:rFonts w:ascii="Consolas" w:cs="Consolas" w:eastAsia="Consolas" w:hAnsi="Consolas"/>
+                <w:sz w:val="18"/>
+                <w:szCs w:val="18"/>
+              </w:rPr>
+              <w:t xml:space="preserve">  "period": { "start": "2026-06-01", "end": "2026-06-30" },</w:t>
+            </w:r>
+          </w:p>
+          <w:p>
+            <w:pPr>
+              <w:spacing w:after="0" w:line="240"/>
+            </w:pPr>
+            <w:r>
+              <w:rPr>
+                <w:rFonts w:ascii="Consolas" w:cs="Consolas" w:eastAsia="Consolas" w:hAnsi="Consolas"/>
+                <w:sz w:val="18"/>
+                <w:szCs w:val="18"/>
+              </w:rPr>
+              <w:t xml:space="preserve">  "comparisonPeriod": { "start": "2026-05-01", "end": "2026-05-31" },</w:t>
+            </w:r>
+          </w:p>
+          <w:p>
+            <w:pPr>
+              <w:spacing w:after="0" w:line="240"/>
+            </w:pPr>
+            <w:r>
+              <w:rPr>
+                <w:rFonts w:ascii="Consolas" w:cs="Consolas" w:eastAsia="Consolas" w:hAnsi="Consolas"/>
+                <w:sz w:val="18"/>
+                <w:szCs w:val="18"/>
+              </w:rPr>
+              <w:t xml:space="preserve">  "stats": { "students": 18, "domains": 6, "assessments": 214 },</w:t>
+            </w:r>
+          </w:p>
+          <w:p>
+            <w:pPr>
+              <w:spacing w:after="0" w:line="240"/>
+            </w:pPr>
+            <w:r>
+              <w:rPr>
+                <w:rFonts w:ascii="Consolas" w:cs="Consolas" w:eastAsia="Consolas" w:hAnsi="Consolas"/>
+                <w:sz w:val="18"/>
+                <w:szCs w:val="18"/>
+              </w:rPr>
+              <w:t xml:space="preserve">  "domains": [</w:t>
+            </w:r>
+          </w:p>
+          <w:p>
+            <w:pPr>
+              <w:spacing w:after="0" w:line="240"/>
+            </w:pPr>
+            <w:r>
+              <w:rPr>
+                <w:rFonts w:ascii="Consolas" w:cs="Consolas" w:eastAsia="Consolas" w:hAnsi="Consolas"/>
+                <w:sz w:val="18"/>
+                <w:szCs w:val="18"/>
+              </w:rPr>
+              <w:t xml:space="preserve">    {</w:t>
+            </w:r>
+          </w:p>
+          <w:p>
+            <w:pPr>
+              <w:spacing w:after="0" w:line="240"/>
+            </w:pPr>
+            <w:r>
+              <w:rPr>
+                <w:rFonts w:ascii="Consolas" w:cs="Consolas" w:eastAsia="Consolas" w:hAnsi="Consolas"/>
+                <w:sz w:val="18"/>
+                <w:szCs w:val="18"/>
+              </w:rPr>
+              <w:t xml:space="preserve">      "domainId": "d1a2...-domain-uuid",</w:t>
+            </w:r>
+          </w:p>
+          <w:p>
+            <w:pPr>
+              <w:spacing w:after="0" w:line="240"/>
+            </w:pPr>
+            <w:r>
+              <w:rPr>
+                <w:rFonts w:ascii="Consolas" w:cs="Consolas" w:eastAsia="Consolas" w:hAnsi="Consolas"/>
+                <w:sz w:val="18"/>
+                <w:szCs w:val="18"/>
+              </w:rPr>
+              <w:t xml:space="preserve">      "name": "Social &amp; Emotional",</w:t>
+            </w:r>
+          </w:p>
+          <w:p>
+            <w:pPr>
+              <w:spacing w:after="0" w:line="240"/>
+            </w:pPr>
+            <w:r>
+              <w:rPr>
+                <w:rFonts w:ascii="Consolas" w:cs="Consolas" w:eastAsia="Consolas" w:hAnsi="Consolas"/>
+                <w:sz w:val="18"/>
+                <w:szCs w:val="18"/>
+              </w:rPr>
+              <w:t xml:space="preserve">      "average": 3.8,</w:t>
+            </w:r>
+          </w:p>
+          <w:p>
+            <w:pPr>
+              <w:spacing w:after="0" w:line="240"/>
+            </w:pPr>
+            <w:r>
+              <w:rPr>
+                <w:rFonts w:ascii="Consolas" w:cs="Consolas" w:eastAsia="Consolas" w:hAnsi="Consolas"/>
+                <w:sz w:val="18"/>
+                <w:szCs w:val="18"/>
+              </w:rPr>
+              <w:t xml:space="preserve">      "comparisonAverage": 3.5,</w:t>
+            </w:r>
+          </w:p>
+          <w:p>
+            <w:pPr>
+              <w:spacing w:after="0" w:line="240"/>
+            </w:pPr>
+            <w:r>
+              <w:rPr>
+                <w:rFonts w:ascii="Consolas" w:cs="Consolas" w:eastAsia="Consolas" w:hAnsi="Consolas"/>
+                <w:sz w:val="18"/>
+                <w:szCs w:val="18"/>
+              </w:rPr>
+              <w:t xml:space="preserve">      "subdomains": [</w:t>
+            </w:r>
+          </w:p>
+          <w:p>
+            <w:pPr>
+              <w:spacing w:after="0" w:line="240"/>
+            </w:pPr>
+            <w:r>
+              <w:rPr>
+                <w:rFonts w:ascii="Consolas" w:cs="Consolas" w:eastAsia="Consolas" w:hAnsi="Consolas"/>
+                <w:sz w:val="18"/>
+                <w:szCs w:val="18"/>
+              </w:rPr>
+              <w:t xml:space="preserve">        {</w:t>
+            </w:r>
+          </w:p>
+          <w:p>
+            <w:pPr>
+              <w:spacing w:after="0" w:line="240"/>
+            </w:pPr>
+            <w:r>
+              <w:rPr>
+                <w:rFonts w:ascii="Consolas" w:cs="Consolas" w:eastAsia="Consolas" w:hAnsi="Consolas"/>
+                <w:sz w:val="18"/>
+                <w:szCs w:val="18"/>
+              </w:rPr>
+              <w:t xml:space="preserve">          "subdomainId": "s1b2...-subdomain-uuid",</w:t>
+            </w:r>
+          </w:p>
+          <w:p>
+            <w:pPr>
+              <w:spacing w:after="0" w:line="240"/>
+            </w:pPr>
+            <w:r>
+              <w:rPr>
+                <w:rFonts w:ascii="Consolas" w:cs="Consolas" w:eastAsia="Consolas" w:hAnsi="Consolas"/>
+                <w:sz w:val="18"/>
+                <w:szCs w:val="18"/>
+              </w:rPr>
+              <w:t xml:space="preserve">          "name": "Emotional Regulation",</w:t>
+            </w:r>
+          </w:p>
+          <w:p>
+            <w:pPr>
+              <w:spacing w:after="0" w:line="240"/>
+            </w:pPr>
+            <w:r>
+              <w:rPr>
+                <w:rFonts w:ascii="Consolas" w:cs="Consolas" w:eastAsia="Consolas" w:hAnsi="Consolas"/>
+                <w:sz w:val="18"/>
+                <w:szCs w:val="18"/>
+              </w:rPr>
+              <w:t xml:space="preserve">          "average": 3.9,</w:t>
+            </w:r>
+          </w:p>
+          <w:p>
+            <w:pPr>
+              <w:spacing w:after="0" w:line="240"/>
+            </w:pPr>
+            <w:r>
+              <w:rPr>
+                <w:rFonts w:ascii="Consolas" w:cs="Consolas" w:eastAsia="Consolas" w:hAnsi="Consolas"/>
+                <w:sz w:val="18"/>
+                <w:szCs w:val="18"/>
+              </w:rPr>
+              <w:t xml:space="preserve">          "comparisonAverage": 3.6</w:t>
+            </w:r>
+          </w:p>
+          <w:p>
+            <w:pPr>
+              <w:spacing w:after="0" w:line="240"/>
+            </w:pPr>
+            <w:r>
+              <w:rPr>
+                <w:rFonts w:ascii="Consolas" w:cs="Consolas" w:eastAsia="Consolas" w:hAnsi="Consolas"/>
+                <w:sz w:val="18"/>
+                <w:szCs w:val="18"/>
+              </w:rPr>
+              <w:t xml:space="preserve">        }</w:t>
+            </w:r>
+          </w:p>
+          <w:p>
+            <w:pPr>
+              <w:spacing w:after="0" w:line="240"/>
+            </w:pPr>
+            <w:r>
+              <w:rPr>
+                <w:rFonts w:ascii="Consolas" w:cs="Consolas" w:eastAsia="Consolas" w:hAnsi="Consolas"/>
+                <w:sz w:val="18"/>
+                <w:szCs w:val="18"/>
+              </w:rPr>
+              <w:t xml:space="preserve">      ]</w:t>
+            </w:r>
+          </w:p>
+          <w:p>
+            <w:pPr>
+              <w:spacing w:after="0" w:line="240"/>
+            </w:pPr>
+            <w:r>
+              <w:rPr>
+                <w:rFonts w:ascii="Consolas" w:cs="Consolas" w:eastAsia="Consolas" w:hAnsi="Consolas"/>
+                <w:sz w:val="18"/>
+                <w:szCs w:val="18"/>
+              </w:rPr>
+              <w:t xml:space="preserve">    }</w:t>
+            </w:r>
+          </w:p>
+          <w:p>
+            <w:pPr>
+              <w:spacing w:after="0" w:line="240"/>
+            </w:pPr>
+            <w:r>
+              <w:rPr>
+                <w:rFonts w:ascii="Consolas" w:cs="Consolas" w:eastAsia="Consolas" w:hAnsi="Consolas"/>
+                <w:sz w:val="18"/>
+                <w:szCs w:val="18"/>
+              </w:rPr>
+              <w:t xml:space="preserve">  ]</w:t>
+            </w:r>
+          </w:p>
+          <w:p>
+            <w:pPr>
+              <w:spacing w:after="0" w:line="240"/>
+            </w:pPr>
+            <w:r>
+              <w:rPr>
+                <w:rFonts w:ascii="Consolas" w:cs="Consolas" w:eastAsia="Consolas" w:hAnsi="Consolas"/>
+                <w:sz w:val="18"/>
+                <w:szCs w:val="18"/>
+              </w:rPr>
+              <w:t xml:space="preserve">}</w:t>
+            </w:r>
+          </w:p>
+        </w:tc>
+      </w:tr>
+    </w:tbl>
     <w:sectPr>
       <w:footerReference w:type="default" r:id="rId7"/>
       <w:pgSz w:w="12240" w:h="15840" w:orient="portrait"/>

</xml_diff>